<commit_message>
km bis zur Grenze - Variable
</commit_message>
<xml_diff>
--- a/MeinMaterial/Besprechungen/TODO.docx
+++ b/MeinMaterial/Besprechungen/TODO.docx
@@ -8,11 +8,16 @@
       </w:r>
     </w:p>
     <w:p>
+      <w:proofErr w:type="gramStart"/>
       <w:r>
         <w:t xml:space="preserve">Steuer </w:t>
       </w:r>
       <w:r>
-        <w:t xml:space="preserve">? welche </w:t>
+        <w:t>?</w:t>
+      </w:r>
+      <w:proofErr w:type="gramEnd"/>
+      <w:r>
+        <w:t xml:space="preserve"> welche </w:t>
       </w:r>
       <w:proofErr w:type="spellStart"/>
       <w:r>
@@ -29,13 +34,31 @@
     <w:p/>
     <w:p>
       <w:r>
-        <w:t xml:space="preserve">Variablen nicht nur mitteln sondern teils auch summieren wenn Strukturvariablen auf </w:t>
-      </w:r>
-      <w:proofErr w:type="spellStart"/>
+        <w:t xml:space="preserve">Variablen nicht nur </w:t>
+      </w:r>
+      <w:proofErr w:type="gramStart"/>
+      <w:r>
+        <w:t>mitteln</w:t>
+      </w:r>
+      <w:proofErr w:type="gramEnd"/>
+      <w:r>
+        <w:t xml:space="preserve"> sondern teils auch </w:t>
+      </w:r>
+      <w:proofErr w:type="gramStart"/>
+      <w:r>
+        <w:t>summieren</w:t>
+      </w:r>
+      <w:proofErr w:type="gramEnd"/>
+      <w:r>
+        <w:t xml:space="preserve"> wenn Strukturvariablen auf </w:t>
+      </w:r>
+      <w:proofErr w:type="spellStart"/>
+      <w:proofErr w:type="gramStart"/>
       <w:r>
         <w:t>agg.schlüssel</w:t>
       </w:r>
       <w:proofErr w:type="spellEnd"/>
+      <w:proofErr w:type="gramEnd"/>
       <w:r>
         <w:t xml:space="preserve"> aggregiert werden</w:t>
       </w:r>
@@ -160,7 +183,15 @@
     </w:p>
     <w:p>
       <w:r>
-        <w:t>Standardisierte Strukturvariablen Verteilung betrachten (interessanter wenn zentriert)</w:t>
+        <w:t>Standardisierte Strukturvariablen Verteilung betrachten (</w:t>
+      </w:r>
+      <w:proofErr w:type="gramStart"/>
+      <w:r>
+        <w:t>interessanter</w:t>
+      </w:r>
+      <w:proofErr w:type="gramEnd"/>
+      <w:r>
+        <w:t xml:space="preserve"> wenn zentriert)</w:t>
       </w:r>
     </w:p>
     <w:p/>
@@ -181,11 +212,11 @@
       <w:r>
         <w:t xml:space="preserve"> bis nächstes </w:t>
       </w:r>
-      <w:proofErr w:type="spellStart"/>
+      <w:proofErr w:type="gramStart"/>
       <w:r>
         <w:t>mal</w:t>
       </w:r>
-      <w:proofErr w:type="spellEnd"/>
+      <w:proofErr w:type="gramEnd"/>
       <w:r>
         <w:t xml:space="preserve"> vorzeigen</w:t>
       </w:r>
@@ -245,19 +276,17 @@
       </w:r>
       <w:r>
         <w:br/>
-        <w:t xml:space="preserve">wie berechnen sich </w:t>
-      </w:r>
-      <w:proofErr w:type="spellStart"/>
-      <w:r>
-        <w:t>variablne</w:t>
-      </w:r>
-      <w:proofErr w:type="spellEnd"/>
-      <w:r>
-        <w:t xml:space="preserve">? </w:t>
-      </w:r>
-      <w:proofErr w:type="spellStart"/>
-      <w:r>
-        <w:t>Z.b.</w:t>
+        <w:t>wie berechnen sich variabl</w:t>
+      </w:r>
+      <w:r>
+        <w:t>en</w:t>
+      </w:r>
+      <w:r>
+        <w:t>? Z</w:t>
+      </w:r>
+      <w:proofErr w:type="spellStart"/>
+      <w:r>
+        <w:t>.b.</w:t>
       </w:r>
       <w:proofErr w:type="spellEnd"/>
       <w:r>
@@ -271,40 +300,42 @@
     </w:p>
     <w:p/>
     <w:p>
-      <w:pPr>
-        <w:rPr>
-          <w:lang w:val="en-US"/>
-        </w:rPr>
-      </w:pPr>
-      <w:proofErr w:type="spellStart"/>
-      <w:r>
-        <w:rPr>
-          <w:lang w:val="en-US"/>
-        </w:rPr>
+      <w:r>
         <w:t>Variablenselektion</w:t>
       </w:r>
-      <w:proofErr w:type="spellEnd"/>
-      <w:r>
-        <w:rPr>
-          <w:lang w:val="en-US"/>
-        </w:rPr>
+      <w:r>
         <w:br/>
-        <w:t>Cross validation ansatz, p</w:t>
-      </w:r>
-      <w:r>
-        <w:rPr>
-          <w:lang w:val="en-US"/>
-        </w:rPr>
-        <w:t>ower</w:t>
-      </w:r>
-    </w:p>
-    <w:p>
-      <w:pPr>
-        <w:rPr>
-          <w:lang w:val="en-US"/>
-        </w:rPr>
-      </w:pPr>
-    </w:p>
+        <w:t xml:space="preserve">Cross </w:t>
+      </w:r>
+      <w:proofErr w:type="spellStart"/>
+      <w:r>
+        <w:t>validation</w:t>
+      </w:r>
+      <w:proofErr w:type="spellEnd"/>
+      <w:r>
+        <w:t xml:space="preserve"> </w:t>
+      </w:r>
+      <w:proofErr w:type="spellStart"/>
+      <w:r>
+        <w:t>ansatz</w:t>
+      </w:r>
+      <w:proofErr w:type="spellEnd"/>
+      <w:r>
+        <w:t>, power</w:t>
+      </w:r>
+    </w:p>
+    <w:p/>
+    <w:p>
+      <w:proofErr w:type="spellStart"/>
+      <w:r>
+        <w:t>Iter_max</w:t>
+      </w:r>
+      <w:proofErr w:type="spellEnd"/>
+      <w:r>
+        <w:t xml:space="preserve"> in Appendix</w:t>
+      </w:r>
+    </w:p>
+    <w:p/>
     <w:tbl>
       <w:tblPr>
         <w:tblW w:w="0" w:type="auto"/>
@@ -511,15 +542,7 @@
           </w:tcPr>
           <w:p>
             <w:r>
-              <w:t xml:space="preserve">gewichtet mit angenäherter Zahl </w:t>
-            </w:r>
-            <w:proofErr w:type="spellStart"/>
-            <w:r>
-              <w:t>Arbeitsloser</w:t>
-            </w:r>
-            <w:proofErr w:type="spellEnd"/>
-            <w:r>
-              <w:t xml:space="preserve">: </w:t>
+              <w:t xml:space="preserve">gewichtet mit angenäherter Zahl Arbeitsloser: </w:t>
             </w:r>
             <w:proofErr w:type="spellStart"/>
             <w:r>
@@ -750,6 +773,7 @@
           </w:tcPr>
           <w:p>
             <w:r>
+              <w:lastRenderedPageBreak/>
               <w:t>bevoelkerung6_2023</w:t>
             </w:r>
           </w:p>
@@ -815,7 +839,6 @@
           </w:tcPr>
           <w:p>
             <w:r>
-              <w:lastRenderedPageBreak/>
               <w:t>bevoelkerung618_2023</w:t>
             </w:r>
           </w:p>
@@ -1384,22 +1407,28 @@
           </w:tcPr>
           <w:p>
             <w:r>
-              <w:t>Einwohner + Arbeitsplätze je km²</w:t>
-            </w:r>
-          </w:p>
-        </w:tc>
-        <w:tc>
-          <w:tcPr>
-            <w:tcW w:w="0" w:type="auto"/>
-            <w:vAlign w:val="center"/>
-            <w:hideMark/>
-          </w:tcPr>
-          <w:p>
-            <w:r>
+              <w:t xml:space="preserve">Einwohner + </w:t>
+            </w:r>
+            <w:r>
+              <w:lastRenderedPageBreak/>
+              <w:t>Arbeitsplätze je km²</w:t>
+            </w:r>
+          </w:p>
+        </w:tc>
+        <w:tc>
+          <w:tcPr>
+            <w:tcW w:w="0" w:type="auto"/>
+            <w:vAlign w:val="center"/>
+            <w:hideMark/>
+          </w:tcPr>
+          <w:p>
+            <w:r>
+              <w:lastRenderedPageBreak/>
               <w:t xml:space="preserve">speziell flächengewichtet, Fläche angenähert über </w:t>
             </w:r>
             <w:proofErr w:type="spellStart"/>
             <w:r>
+              <w:lastRenderedPageBreak/>
               <w:t>bevoelkerung</w:t>
             </w:r>
             <w:proofErr w:type="spellEnd"/>
@@ -1461,6 +1490,7 @@
         </w:numPr>
       </w:pPr>
       <w:proofErr w:type="spellStart"/>
+      <w:proofErr w:type="gramStart"/>
       <w:r>
         <w:t>lphom</w:t>
       </w:r>
@@ -1469,6 +1499,7 @@
         <w:t>::</w:t>
       </w:r>
       <w:proofErr w:type="spellStart"/>
+      <w:proofErr w:type="gramEnd"/>
       <w:r>
         <w:t>nslphom</w:t>
       </w:r>
@@ -1613,9 +1644,14 @@
       </w:r>
       <w:proofErr w:type="spellStart"/>
       <w:r>
-        <w:t>nslphom_functions.R</w:t>
-      </w:r>
-      <w:proofErr w:type="spellEnd"/>
+        <w:t>nslphom_</w:t>
+      </w:r>
+      <w:proofErr w:type="gramStart"/>
+      <w:r>
+        <w:t>functions.R</w:t>
+      </w:r>
+      <w:proofErr w:type="spellEnd"/>
+      <w:proofErr w:type="gramEnd"/>
       <w:r>
         <w:t xml:space="preserve"> (</w:t>
       </w:r>
@@ -1625,7 +1661,15 @@
       </w:r>
       <w:proofErr w:type="spellEnd"/>
       <w:r>
-        <w:t xml:space="preserve"> 680)](C:/Users/Leonie/Documents/Studium/Bachelorarbeit/Waehlendenwanderung/Functions/nslphom_functions.R:680). Für einen echten OSQP-Lauf müsste der lokale Solver ebenfalls festgelegt und validiert werden.</w:t>
+        <w:t xml:space="preserve"> 680</w:t>
+      </w:r>
+      <w:proofErr w:type="gramStart"/>
+      <w:r>
+        <w:t>)](</w:t>
+      </w:r>
+      <w:proofErr w:type="gramEnd"/>
+      <w:r>
+        <w:t>C:/Users/Leonie/Documents/Studium/Bachelorarbeit/Waehlendenwanderung/Functions/nslphom_functions.R:680). Für einen echten OSQP-Lauf müsste der lokale Solver ebenfalls festgelegt und validiert werden.</w:t>
       </w:r>
     </w:p>
     <w:p>
@@ -1654,7 +1698,15 @@
       </w:r>
       <w:r>
         <w:br/>
-        <w:t>[13_find_optimal_iter_max_nslphom_dual.R (</w:t>
+        <w:t>[13_find_optimal_iter_max_nslphom_</w:t>
+      </w:r>
+      <w:proofErr w:type="gramStart"/>
+      <w:r>
+        <w:t>dual.R</w:t>
+      </w:r>
+      <w:proofErr w:type="gramEnd"/>
+      <w:r>
+        <w:t xml:space="preserve"> (</w:t>
       </w:r>
       <w:proofErr w:type="spellStart"/>
       <w:r>
@@ -1662,7 +1714,15 @@
       </w:r>
       <w:proofErr w:type="spellEnd"/>
       <w:r>
-        <w:t xml:space="preserve"> 25)](C:/Users/Leonie/Documents/Studium/Bachelorarbeit/Waehlendenwanderung/Scripts/13_find_optimal_iter_max_nslphom_dual.R:25) ist implementiert, vorhanden sind aber nur Smoke-Test-Outputs. Ein belastbares Ergebnis für den finalen Solver und die finale Oststichprobe fehlt.</w:t>
+        <w:t xml:space="preserve"> 25</w:t>
+      </w:r>
+      <w:proofErr w:type="gramStart"/>
+      <w:r>
+        <w:t>)](</w:t>
+      </w:r>
+      <w:proofErr w:type="gramEnd"/>
+      <w:r>
+        <w:t>C:/Users/Leonie/Documents/Studium/Bachelorarbeit/Waehlendenwanderung/Scripts/13_find_optimal_iter_max_nslphom_dual.R:25) ist implementiert, vorhanden sind aber nur Smoke-Test-Outputs. Ein belastbares Ergebnis für den finalen Solver und die finale Oststichprobe fehlt.</w:t>
       </w:r>
     </w:p>
     <w:p>
@@ -1692,6 +1752,7 @@
           <w:b/>
           <w:bCs/>
         </w:rPr>
+        <w:lastRenderedPageBreak/>
         <w:t>6. Regressionsmodell ist noch vorläufig</w:t>
       </w:r>
       <w:r>
@@ -1700,9 +1761,14 @@
       </w:r>
       <w:proofErr w:type="spellStart"/>
       <w:r>
-        <w:t>regression_functions.R</w:t>
-      </w:r>
-      <w:proofErr w:type="spellEnd"/>
+        <w:t>regression_</w:t>
+      </w:r>
+      <w:proofErr w:type="gramStart"/>
+      <w:r>
+        <w:t>functions.R</w:t>
+      </w:r>
+      <w:proofErr w:type="spellEnd"/>
+      <w:proofErr w:type="gramEnd"/>
       <w:r>
         <w:t xml:space="preserve"> (</w:t>
       </w:r>
@@ -1712,7 +1778,15 @@
       </w:r>
       <w:proofErr w:type="spellEnd"/>
       <w:r>
-        <w:t xml:space="preserve"> 164)](C:/Users/Leonie/Documents/Studium/Bachelorarbeit/Waehlendenwanderung/Functions/regression_functions.R:164).</w:t>
+        <w:t xml:space="preserve"> 164</w:t>
+      </w:r>
+      <w:proofErr w:type="gramStart"/>
+      <w:r>
+        <w:t>)](</w:t>
+      </w:r>
+      <w:proofErr w:type="gramEnd"/>
+      <w:r>
+        <w:t>C:/Users/Leonie/Documents/Studium/Bachelorarbeit/Waehlendenwanderung/Functions/regression_functions.R:164).</w:t>
       </w:r>
     </w:p>
     <w:p>
@@ -1728,7 +1802,6 @@
         </w:numPr>
       </w:pPr>
       <w:r>
-        <w:lastRenderedPageBreak/>
         <w:t xml:space="preserve">gewichtetes lineares Modell oder geplantes </w:t>
       </w:r>
       <w:proofErr w:type="spellStart"/>
@@ -1872,7 +1945,15 @@
       </w:r>
       <w:r>
         <w:br/>
-        <w:t>Alle Berliner Einheiten erhalten aktuell über 11000000 dieselben Gesamtberliner INKAR-Werte, siehe [03_prepare_inkar_covariates.R (</w:t>
+        <w:t>Alle Berliner Einheiten erhalten aktuell über 11000000 dieselben Gesamtberliner INKAR-Werte, siehe [03_prepare_inkar_</w:t>
+      </w:r>
+      <w:proofErr w:type="gramStart"/>
+      <w:r>
+        <w:t>covariates.R</w:t>
+      </w:r>
+      <w:proofErr w:type="gramEnd"/>
+      <w:r>
+        <w:t xml:space="preserve"> (</w:t>
       </w:r>
       <w:proofErr w:type="spellStart"/>
       <w:r>
@@ -1880,7 +1961,15 @@
       </w:r>
       <w:proofErr w:type="spellEnd"/>
       <w:r>
-        <w:t xml:space="preserve"> 146)](C:/Users/Leonie/Documents/Studium/Bachelorarbeit/Waehlendenwanderung/Scripts/03_prepare_inkar_covariates.R:146).</w:t>
+        <w:t xml:space="preserve"> 146</w:t>
+      </w:r>
+      <w:proofErr w:type="gramStart"/>
+      <w:r>
+        <w:t>)](</w:t>
+      </w:r>
+      <w:proofErr w:type="gramEnd"/>
+      <w:r>
+        <w:t>C:/Users/Leonie/Documents/Studium/Bachelorarbeit/Waehlendenwanderung/Scripts/03_prepare_inkar_covariates.R:146).</w:t>
       </w:r>
     </w:p>
     <w:p>
@@ -2004,7 +2093,15 @@
     </w:p>
     <w:p>
       <w:r>
-        <w:t>Kurz: Ja, die Läufe machen jetzt grundsätzlich Sinn. Das Projekt ist deutlich näher an einem reproduzierbaren Stand als vorher. Aber ich würde morgen nicht blind 00_run_pipeline.R starten und hoffen, dass alles sauber durchläuft. Ich würde kontrolliert in Etappen laufen lassen.</w:t>
+        <w:t>Kurz: Ja, die Läufe machen jetzt grundsätzlich Sinn. Das Projekt ist deutlich näher an einem reproduzierbaren Stand als vorher. Aber ich würde morgen nicht blind 00_run_</w:t>
+      </w:r>
+      <w:proofErr w:type="gramStart"/>
+      <w:r>
+        <w:t>pipeline.R</w:t>
+      </w:r>
+      <w:proofErr w:type="gramEnd"/>
+      <w:r>
+        <w:t xml:space="preserve"> starten und hoffen, dass alles sauber durchläuft. Ich würde kontrolliert in Etappen laufen lassen.</w:t>
       </w:r>
     </w:p>
     <w:p>
@@ -2195,8 +2292,17 @@
           <w:b/>
           <w:bCs/>
         </w:rPr>
-        <w:t>Was morgen Priorität hat</w:t>
-      </w:r>
+        <w:t xml:space="preserve">Was morgen Priorität </w:t>
+      </w:r>
+      <w:proofErr w:type="gramStart"/>
+      <w:r>
+        <w:rPr>
+          <w:b/>
+          <w:bCs/>
+        </w:rPr>
+        <w:t>hat</w:t>
+      </w:r>
+      <w:proofErr w:type="gramEnd"/>
       <w:r>
         <w:br/>
         <w:t>Auf dem guten Rechner würde ich diese Reihenfolge nehmen:</w:t>
@@ -2204,7 +2310,9 @@
     </w:p>
     <w:p>
       <w:proofErr w:type="spellStart"/>
-      <w:r>
+      <w:proofErr w:type="gramStart"/>
+      <w:r>
+        <w:lastRenderedPageBreak/>
         <w:t>options</w:t>
       </w:r>
       <w:proofErr w:type="spellEnd"/>
@@ -2213,7 +2321,11 @@
       </w:r>
       <w:proofErr w:type="spellStart"/>
       <w:r>
-        <w:t>waehlendenwanderung.nslphom_solver</w:t>
+        <w:t>waehlendenwanderung.nslphom</w:t>
+      </w:r>
+      <w:proofErr w:type="gramEnd"/>
+      <w:r>
+        <w:t>_solver</w:t>
       </w:r>
       <w:proofErr w:type="spellEnd"/>
       <w:r>
@@ -2230,6 +2342,7 @@
     </w:p>
     <w:p>
       <w:proofErr w:type="spellStart"/>
+      <w:proofErr w:type="gramStart"/>
       <w:r>
         <w:t>options</w:t>
       </w:r>
@@ -2239,7 +2352,11 @@
       </w:r>
       <w:proofErr w:type="spellStart"/>
       <w:r>
-        <w:t>waehlendenwanderung.nslphom_iter_max</w:t>
+        <w:t>waehlendenwanderung.nslphom</w:t>
+      </w:r>
+      <w:proofErr w:type="gramEnd"/>
+      <w:r>
+        <w:t>_iter_max</w:t>
       </w:r>
       <w:proofErr w:type="spellEnd"/>
       <w:r>
@@ -2253,38 +2370,103 @@
           <w:lang w:val="en-US"/>
         </w:rPr>
       </w:pPr>
-      <w:r>
-        <w:rPr>
-          <w:lang w:val="en-US"/>
-        </w:rPr>
-        <w:t>source("Scripts/02a_fit_deutschland_homogenitaet.R", encoding = "UTF-8")</w:t>
-      </w:r>
-    </w:p>
-    <w:p>
-      <w:pPr>
-        <w:rPr>
-          <w:lang w:val="en-US"/>
-        </w:rPr>
-      </w:pPr>
-      <w:r>
-        <w:rPr>
-          <w:lang w:val="en-US"/>
-        </w:rPr>
-        <w:lastRenderedPageBreak/>
-        <w:t>source("Scripts/02_estimate_transitions.R", encoding = "UTF-8")</w:t>
-      </w:r>
-    </w:p>
-    <w:p>
-      <w:pPr>
-        <w:rPr>
-          <w:lang w:val="en-US"/>
-        </w:rPr>
-      </w:pPr>
-      <w:r>
-        <w:rPr>
-          <w:lang w:val="en-US"/>
-        </w:rPr>
-        <w:t>source("Scripts/04_model_transitions.R", encoding = "UTF-8")</w:t>
+      <w:proofErr w:type="gramStart"/>
+      <w:r>
+        <w:rPr>
+          <w:lang w:val="en-US"/>
+        </w:rPr>
+        <w:t>source(</w:t>
+      </w:r>
+      <w:proofErr w:type="gramEnd"/>
+      <w:r>
+        <w:rPr>
+          <w:lang w:val="en-US"/>
+        </w:rPr>
+        <w:t>"Scripts/02a_fit_deutschland_</w:t>
+      </w:r>
+      <w:proofErr w:type="gramStart"/>
+      <w:r>
+        <w:rPr>
+          <w:lang w:val="en-US"/>
+        </w:rPr>
+        <w:t>homogenitaet.R</w:t>
+      </w:r>
+      <w:proofErr w:type="gramEnd"/>
+      <w:r>
+        <w:rPr>
+          <w:lang w:val="en-US"/>
+        </w:rPr>
+        <w:t>", encoding = "UTF-8")</w:t>
+      </w:r>
+    </w:p>
+    <w:p>
+      <w:pPr>
+        <w:rPr>
+          <w:lang w:val="en-US"/>
+        </w:rPr>
+      </w:pPr>
+      <w:proofErr w:type="gramStart"/>
+      <w:r>
+        <w:rPr>
+          <w:lang w:val="en-US"/>
+        </w:rPr>
+        <w:t>source(</w:t>
+      </w:r>
+      <w:proofErr w:type="gramEnd"/>
+      <w:r>
+        <w:rPr>
+          <w:lang w:val="en-US"/>
+        </w:rPr>
+        <w:t>"Scripts/02_estimate_</w:t>
+      </w:r>
+      <w:proofErr w:type="gramStart"/>
+      <w:r>
+        <w:rPr>
+          <w:lang w:val="en-US"/>
+        </w:rPr>
+        <w:t>transitions.R</w:t>
+      </w:r>
+      <w:proofErr w:type="gramEnd"/>
+      <w:r>
+        <w:rPr>
+          <w:lang w:val="en-US"/>
+        </w:rPr>
+        <w:t>", encoding = "UTF-8")</w:t>
+      </w:r>
+    </w:p>
+    <w:p>
+      <w:pPr>
+        <w:rPr>
+          <w:lang w:val="en-US"/>
+        </w:rPr>
+      </w:pPr>
+      <w:proofErr w:type="gramStart"/>
+      <w:r>
+        <w:rPr>
+          <w:lang w:val="en-US"/>
+        </w:rPr>
+        <w:t>source(</w:t>
+      </w:r>
+      <w:proofErr w:type="gramEnd"/>
+      <w:r>
+        <w:rPr>
+          <w:lang w:val="en-US"/>
+        </w:rPr>
+        <w:t>"Scripts/04_model_</w:t>
+      </w:r>
+      <w:proofErr w:type="gramStart"/>
+      <w:r>
+        <w:rPr>
+          <w:lang w:val="en-US"/>
+        </w:rPr>
+        <w:t>transitions.R</w:t>
+      </w:r>
+      <w:proofErr w:type="gramEnd"/>
+      <w:r>
+        <w:rPr>
+          <w:lang w:val="en-US"/>
+        </w:rPr>
+        <w:t>", encoding = "UTF-8")</w:t>
       </w:r>
     </w:p>
     <w:p>
@@ -2406,24 +2588,68 @@
           <w:lang w:val="en-US"/>
         </w:rPr>
       </w:pPr>
-      <w:r>
-        <w:rPr>
-          <w:lang w:val="en-US"/>
-        </w:rPr>
-        <w:t>source("Scripts/13_find_optimal_iter_max_nslphom_dual.R", encoding = "UTF-8")</w:t>
-      </w:r>
-    </w:p>
-    <w:p>
-      <w:pPr>
-        <w:rPr>
-          <w:lang w:val="en-US"/>
-        </w:rPr>
-      </w:pPr>
-      <w:r>
-        <w:rPr>
-          <w:lang w:val="en-US"/>
-        </w:rPr>
-        <w:t>source("Scripts/05c_validate_final_method_dual_osqp.R", encoding = "UTF-8")</w:t>
+      <w:proofErr w:type="gramStart"/>
+      <w:r>
+        <w:rPr>
+          <w:lang w:val="en-US"/>
+        </w:rPr>
+        <w:t>source(</w:t>
+      </w:r>
+      <w:proofErr w:type="gramEnd"/>
+      <w:r>
+        <w:rPr>
+          <w:lang w:val="en-US"/>
+        </w:rPr>
+        <w:t>"Scripts/13_find_optimal_iter_max_nslphom_</w:t>
+      </w:r>
+      <w:proofErr w:type="gramStart"/>
+      <w:r>
+        <w:rPr>
+          <w:lang w:val="en-US"/>
+        </w:rPr>
+        <w:t>dual.R</w:t>
+      </w:r>
+      <w:proofErr w:type="gramEnd"/>
+      <w:r>
+        <w:rPr>
+          <w:lang w:val="en-US"/>
+        </w:rPr>
+        <w:t>", encoding = "UTF-8")</w:t>
+      </w:r>
+    </w:p>
+    <w:p>
+      <w:pPr>
+        <w:rPr>
+          <w:lang w:val="en-US"/>
+        </w:rPr>
+      </w:pPr>
+      <w:proofErr w:type="gramStart"/>
+      <w:r>
+        <w:rPr>
+          <w:lang w:val="en-US"/>
+        </w:rPr>
+        <w:t>source(</w:t>
+      </w:r>
+      <w:proofErr w:type="gramEnd"/>
+      <w:r>
+        <w:rPr>
+          <w:lang w:val="en-US"/>
+        </w:rPr>
+        <w:t>"Scripts/05c_validate_final_method_dual_</w:t>
+      </w:r>
+      <w:proofErr w:type="gramStart"/>
+      <w:r>
+        <w:rPr>
+          <w:lang w:val="en-US"/>
+        </w:rPr>
+        <w:t>osqp.R</w:t>
+      </w:r>
+      <w:proofErr w:type="gramEnd"/>
+      <w:r>
+        <w:rPr>
+          <w:lang w:val="en-US"/>
+        </w:rPr>
+        <w:t>", encoding = "UTF-8")</w:t>
       </w:r>
     </w:p>
     <w:p>
@@ -2441,6 +2667,7 @@
     </w:p>
     <w:p>
       <w:proofErr w:type="spellStart"/>
+      <w:proofErr w:type="gramStart"/>
       <w:r>
         <w:t>options</w:t>
       </w:r>
@@ -2450,7 +2677,11 @@
       </w:r>
       <w:proofErr w:type="spellStart"/>
       <w:r>
-        <w:t>waehlendenwanderung.bootstrap_n</w:t>
+        <w:t>waehlendenwanderung.bootstrap</w:t>
+      </w:r>
+      <w:proofErr w:type="gramEnd"/>
+      <w:r>
+        <w:t>_n</w:t>
       </w:r>
       <w:proofErr w:type="spellEnd"/>
       <w:r>
@@ -2459,6 +2690,7 @@
     </w:p>
     <w:p>
       <w:proofErr w:type="spellStart"/>
+      <w:proofErr w:type="gramStart"/>
       <w:r>
         <w:t>options</w:t>
       </w:r>
@@ -2468,7 +2700,11 @@
       </w:r>
       <w:proofErr w:type="spellStart"/>
       <w:r>
-        <w:t>waehlendenwanderung.bootstrap_sample_size</w:t>
+        <w:t>waehlendenwanderung.bootstrap</w:t>
+      </w:r>
+      <w:proofErr w:type="gramEnd"/>
+      <w:r>
+        <w:t>_sample_size</w:t>
       </w:r>
       <w:proofErr w:type="spellEnd"/>
       <w:r>
@@ -2481,11 +2717,33 @@
           <w:lang w:val="en-US"/>
         </w:rPr>
       </w:pPr>
-      <w:r>
-        <w:rPr>
-          <w:lang w:val="en-US"/>
-        </w:rPr>
-        <w:t>source("Scripts/08_bootstrap_nslphom_regression.R", encoding = "UTF-8")</w:t>
+      <w:proofErr w:type="gramStart"/>
+      <w:r>
+        <w:rPr>
+          <w:lang w:val="en-US"/>
+        </w:rPr>
+        <w:t>source(</w:t>
+      </w:r>
+      <w:proofErr w:type="gramEnd"/>
+      <w:r>
+        <w:rPr>
+          <w:lang w:val="en-US"/>
+        </w:rPr>
+        <w:t>"Scripts/08_bootstrap_nslphom_</w:t>
+      </w:r>
+      <w:proofErr w:type="gramStart"/>
+      <w:r>
+        <w:rPr>
+          <w:lang w:val="en-US"/>
+        </w:rPr>
+        <w:t>regression.R</w:t>
+      </w:r>
+      <w:proofErr w:type="gramEnd"/>
+      <w:r>
+        <w:rPr>
+          <w:lang w:val="en-US"/>
+        </w:rPr>
+        <w:t>", encoding = "UTF-8")</w:t>
       </w:r>
     </w:p>
     <w:p>
@@ -2515,8 +2773,17 @@
           <w:b/>
           <w:bCs/>
         </w:rPr>
-        <w:t>Was du heute schon laufen lassen kannst</w:t>
-      </w:r>
+        <w:t xml:space="preserve">Was du heute schon </w:t>
+      </w:r>
+      <w:proofErr w:type="gramStart"/>
+      <w:r>
+        <w:rPr>
+          <w:b/>
+          <w:bCs/>
+        </w:rPr>
+        <w:t>laufen lassen kannst</w:t>
+      </w:r>
+      <w:proofErr w:type="gramEnd"/>
       <w:r>
         <w:br/>
         <w:t>Diese Skripte sind nicht der eigentliche Speicherflaschenhals und sollten heute gehen:</w:t>
@@ -2528,20 +2795,36 @@
           <w:lang w:val="en-US"/>
         </w:rPr>
       </w:pPr>
-      <w:r>
-        <w:rPr>
-          <w:lang w:val="en-US"/>
-        </w:rPr>
-        <w:t>source("Scripts/</w:t>
-      </w:r>
-      <w:proofErr w:type="spellStart"/>
-      <w:r>
-        <w:rPr>
-          <w:lang w:val="en-US"/>
-        </w:rPr>
-        <w:t>mapping_gebiete.R</w:t>
-      </w:r>
-      <w:proofErr w:type="spellEnd"/>
+      <w:proofErr w:type="gramStart"/>
+      <w:r>
+        <w:rPr>
+          <w:lang w:val="en-US"/>
+        </w:rPr>
+        <w:t>source(</w:t>
+      </w:r>
+      <w:proofErr w:type="gramEnd"/>
+      <w:r>
+        <w:rPr>
+          <w:lang w:val="en-US"/>
+        </w:rPr>
+        <w:t>"Scripts/</w:t>
+      </w:r>
+      <w:proofErr w:type="spellStart"/>
+      <w:r>
+        <w:rPr>
+          <w:lang w:val="en-US"/>
+        </w:rPr>
+        <w:t>mapping_</w:t>
+      </w:r>
+      <w:proofErr w:type="gramStart"/>
+      <w:r>
+        <w:rPr>
+          <w:lang w:val="en-US"/>
+        </w:rPr>
+        <w:t>gebiete.R</w:t>
+      </w:r>
+      <w:proofErr w:type="spellEnd"/>
+      <w:proofErr w:type="gramEnd"/>
       <w:r>
         <w:rPr>
           <w:lang w:val="en-US"/>
@@ -2555,20 +2838,36 @@
           <w:lang w:val="en-US"/>
         </w:rPr>
       </w:pPr>
-      <w:r>
-        <w:rPr>
-          <w:lang w:val="en-US"/>
-        </w:rPr>
-        <w:t>source("Scripts/</w:t>
-      </w:r>
-      <w:proofErr w:type="spellStart"/>
-      <w:r>
-        <w:rPr>
-          <w:lang w:val="en-US"/>
-        </w:rPr>
-        <w:t>mapping_wahldaten.R</w:t>
-      </w:r>
-      <w:proofErr w:type="spellEnd"/>
+      <w:proofErr w:type="gramStart"/>
+      <w:r>
+        <w:rPr>
+          <w:lang w:val="en-US"/>
+        </w:rPr>
+        <w:t>source(</w:t>
+      </w:r>
+      <w:proofErr w:type="gramEnd"/>
+      <w:r>
+        <w:rPr>
+          <w:lang w:val="en-US"/>
+        </w:rPr>
+        <w:t>"Scripts/</w:t>
+      </w:r>
+      <w:proofErr w:type="spellStart"/>
+      <w:r>
+        <w:rPr>
+          <w:lang w:val="en-US"/>
+        </w:rPr>
+        <w:t>mapping_</w:t>
+      </w:r>
+      <w:proofErr w:type="gramStart"/>
+      <w:r>
+        <w:rPr>
+          <w:lang w:val="en-US"/>
+        </w:rPr>
+        <w:t>wahldaten.R</w:t>
+      </w:r>
+      <w:proofErr w:type="spellEnd"/>
+      <w:proofErr w:type="gramEnd"/>
       <w:r>
         <w:rPr>
           <w:lang w:val="en-US"/>
@@ -2582,33 +2881,28 @@
           <w:lang w:val="en-US"/>
         </w:rPr>
       </w:pPr>
-      <w:r>
-        <w:rPr>
-          <w:lang w:val="en-US"/>
-        </w:rPr>
-        <w:t>source("Scripts/01_prepare_nslphom_input.R", encoding = "UTF-8")</w:t>
-      </w:r>
-    </w:p>
-    <w:p>
-      <w:pPr>
-        <w:rPr>
-          <w:lang w:val="en-US"/>
-        </w:rPr>
-      </w:pPr>
-      <w:r>
-        <w:rPr>
-          <w:lang w:val="en-US"/>
-        </w:rPr>
-        <w:t>source("Scripts/</w:t>
-      </w:r>
-      <w:proofErr w:type="spellStart"/>
-      <w:r>
-        <w:rPr>
-          <w:lang w:val="en-US"/>
-        </w:rPr>
-        <w:t>cleaning_strukturdaten.R</w:t>
-      </w:r>
-      <w:proofErr w:type="spellEnd"/>
+      <w:proofErr w:type="gramStart"/>
+      <w:r>
+        <w:rPr>
+          <w:lang w:val="en-US"/>
+        </w:rPr>
+        <w:t>source(</w:t>
+      </w:r>
+      <w:proofErr w:type="gramEnd"/>
+      <w:r>
+        <w:rPr>
+          <w:lang w:val="en-US"/>
+        </w:rPr>
+        <w:t>"Scripts/01_prepare_nslphom_</w:t>
+      </w:r>
+      <w:proofErr w:type="gramStart"/>
+      <w:r>
+        <w:rPr>
+          <w:lang w:val="en-US"/>
+        </w:rPr>
+        <w:t>input.R</w:t>
+      </w:r>
+      <w:proofErr w:type="gramEnd"/>
       <w:r>
         <w:rPr>
           <w:lang w:val="en-US"/>
@@ -2622,11 +2916,76 @@
           <w:lang w:val="en-US"/>
         </w:rPr>
       </w:pPr>
-      <w:r>
-        <w:rPr>
-          <w:lang w:val="en-US"/>
-        </w:rPr>
-        <w:t>source("Scripts/03_prepare_inkar_covariates.R", encoding = "UTF-8")</w:t>
+      <w:proofErr w:type="gramStart"/>
+      <w:r>
+        <w:rPr>
+          <w:lang w:val="en-US"/>
+        </w:rPr>
+        <w:t>source(</w:t>
+      </w:r>
+      <w:proofErr w:type="gramEnd"/>
+      <w:r>
+        <w:rPr>
+          <w:lang w:val="en-US"/>
+        </w:rPr>
+        <w:t>"Scripts/</w:t>
+      </w:r>
+      <w:proofErr w:type="spellStart"/>
+      <w:r>
+        <w:rPr>
+          <w:lang w:val="en-US"/>
+        </w:rPr>
+        <w:t>cleaning_</w:t>
+      </w:r>
+      <w:proofErr w:type="gramStart"/>
+      <w:r>
+        <w:rPr>
+          <w:lang w:val="en-US"/>
+        </w:rPr>
+        <w:t>strukturdaten.R</w:t>
+      </w:r>
+      <w:proofErr w:type="spellEnd"/>
+      <w:proofErr w:type="gramEnd"/>
+      <w:r>
+        <w:rPr>
+          <w:lang w:val="en-US"/>
+        </w:rPr>
+        <w:t>", encoding = "UTF-8")</w:t>
+      </w:r>
+    </w:p>
+    <w:p>
+      <w:pPr>
+        <w:rPr>
+          <w:lang w:val="en-US"/>
+        </w:rPr>
+      </w:pPr>
+      <w:proofErr w:type="gramStart"/>
+      <w:r>
+        <w:rPr>
+          <w:lang w:val="en-US"/>
+        </w:rPr>
+        <w:t>source(</w:t>
+      </w:r>
+      <w:proofErr w:type="gramEnd"/>
+      <w:r>
+        <w:rPr>
+          <w:lang w:val="en-US"/>
+        </w:rPr>
+        <w:t>"Scripts/03_prepare_inkar_</w:t>
+      </w:r>
+      <w:proofErr w:type="gramStart"/>
+      <w:r>
+        <w:rPr>
+          <w:lang w:val="en-US"/>
+        </w:rPr>
+        <w:t>covariates.R</w:t>
+      </w:r>
+      <w:proofErr w:type="gramEnd"/>
+      <w:r>
+        <w:rPr>
+          <w:lang w:val="en-US"/>
+        </w:rPr>
+        <w:t>", encoding = "UTF-8")</w:t>
       </w:r>
     </w:p>
     <w:p>
@@ -2645,8 +3004,18 @@
           <w:b/>
           <w:bCs/>
         </w:rPr>
-        <w:t>Woran es morgen scheitern könnte</w:t>
-      </w:r>
+        <w:lastRenderedPageBreak/>
+        <w:t xml:space="preserve">Woran es morgen </w:t>
+      </w:r>
+      <w:proofErr w:type="gramStart"/>
+      <w:r>
+        <w:rPr>
+          <w:b/>
+          <w:bCs/>
+        </w:rPr>
+        <w:t>scheitern könnte</w:t>
+      </w:r>
+      <w:proofErr w:type="gramEnd"/>
       <w:r>
         <w:br/>
         <w:t>Die größten Risiken:</w:t>
@@ -2730,10 +3099,12 @@
         <w:t xml:space="preserve">, </w:t>
       </w:r>
       <w:proofErr w:type="spellStart"/>
+      <w:proofErr w:type="gramStart"/>
       <w:r>
         <w:t>data.table</w:t>
       </w:r>
       <w:proofErr w:type="spellEnd"/>
+      <w:proofErr w:type="gramEnd"/>
       <w:r>
         <w:t>, sf, Matrix.</w:t>
       </w:r>
@@ -2759,8 +3130,8 @@
     </w:p>
     <w:p>
       <w:proofErr w:type="spellStart"/>
-      <w:r>
-        <w:lastRenderedPageBreak/>
+      <w:proofErr w:type="gramStart"/>
+      <w:r>
         <w:t>options</w:t>
       </w:r>
       <w:proofErr w:type="spellEnd"/>
@@ -2769,7 +3140,11 @@
       </w:r>
       <w:proofErr w:type="spellStart"/>
       <w:r>
-        <w:t>waehlendenwanderung.osqp_local_solver</w:t>
+        <w:t>waehlendenwanderung.osqp</w:t>
+      </w:r>
+      <w:proofErr w:type="gramEnd"/>
+      <w:r>
+        <w:t>_local_solver</w:t>
       </w:r>
       <w:proofErr w:type="spellEnd"/>
       <w:r>
@@ -2922,9 +3297,17 @@
         <w:rPr>
           <w:lang w:val="en-US"/>
         </w:rPr>
-        <w:t>nslphom_functions.R</w:t>
-      </w:r>
-      <w:proofErr w:type="spellEnd"/>
+        <w:t>nslphom_</w:t>
+      </w:r>
+      <w:proofErr w:type="gramStart"/>
+      <w:r>
+        <w:rPr>
+          <w:lang w:val="en-US"/>
+        </w:rPr>
+        <w:t>functions.R</w:t>
+      </w:r>
+      <w:proofErr w:type="spellEnd"/>
+      <w:proofErr w:type="gramEnd"/>
       <w:r>
         <w:rPr>
           <w:lang w:val="en-US"/>
@@ -2936,9 +3319,17 @@
         <w:rPr>
           <w:lang w:val="en-US"/>
         </w:rPr>
-        <w:t>bootstrap_functions.R</w:t>
-      </w:r>
-      <w:proofErr w:type="spellEnd"/>
+        <w:t>bootstrap_</w:t>
+      </w:r>
+      <w:proofErr w:type="gramStart"/>
+      <w:r>
+        <w:rPr>
+          <w:lang w:val="en-US"/>
+        </w:rPr>
+        <w:t>functions.R</w:t>
+      </w:r>
+      <w:proofErr w:type="spellEnd"/>
+      <w:proofErr w:type="gramEnd"/>
       <w:r>
         <w:rPr>
           <w:lang w:val="en-US"/>
@@ -2950,9 +3341,17 @@
         <w:rPr>
           <w:lang w:val="en-US"/>
         </w:rPr>
-        <w:t>cleaning_strukturdaten.R</w:t>
-      </w:r>
-      <w:proofErr w:type="spellEnd"/>
+        <w:t>cleaning_</w:t>
+      </w:r>
+      <w:proofErr w:type="gramStart"/>
+      <w:r>
+        <w:rPr>
+          <w:lang w:val="en-US"/>
+        </w:rPr>
+        <w:t>strukturdaten.R</w:t>
+      </w:r>
+      <w:proofErr w:type="spellEnd"/>
+      <w:proofErr w:type="gramEnd"/>
       <w:r>
         <w:rPr>
           <w:lang w:val="en-US"/>
@@ -5468,6 +5867,7 @@
   <w:style w:type="character" w:default="1" w:styleId="Absatz-Standardschriftart">
     <w:name w:val="Default Paragraph Font"/>
     <w:uiPriority w:val="1"/>
+    <w:semiHidden/>
     <w:unhideWhenUsed/>
   </w:style>
   <w:style w:type="table" w:default="1" w:styleId="NormaleTabelle">

</xml_diff>

<commit_message>
Validierungs, Visualisierung, Ergebnis-Skripte neue Charts
</commit_message>
<xml_diff>
--- a/MeinMaterial/Besprechungen/TODO.docx
+++ b/MeinMaterial/Besprechungen/TODO.docx
@@ -2,190 +2,6 @@
 <file path=word/document.xml><?xml version="1.0" encoding="utf-8"?>
 <w:document xmlns:wpc="http://schemas.microsoft.com/office/word/2010/wordprocessingCanvas" xmlns:cx="http://schemas.microsoft.com/office/drawing/2014/chartex" xmlns:cx1="http://schemas.microsoft.com/office/drawing/2015/9/8/chartex" xmlns:cx2="http://schemas.microsoft.com/office/drawing/2015/10/21/chartex" xmlns:cx3="http://schemas.microsoft.com/office/drawing/2016/5/9/chartex" xmlns:cx4="http://schemas.microsoft.com/office/drawing/2016/5/10/chartex" xmlns:cx5="http://schemas.microsoft.com/office/drawing/2016/5/11/chartex" xmlns:cx6="http://schemas.microsoft.com/office/drawing/2016/5/12/chartex" xmlns:cx7="http://schemas.microsoft.com/office/drawing/2016/5/13/chartex" xmlns:cx8="http://schemas.microsoft.com/office/drawing/2016/5/14/chartex" xmlns:mc="http://schemas.openxmlformats.org/markup-compatibility/2006" xmlns:aink="http://schemas.microsoft.com/office/drawing/2016/ink" xmlns:am3d="http://schemas.microsoft.com/office/drawing/2017/model3d" xmlns:o="urn:schemas-microsoft-com:office:office" xmlns:oel="http://schemas.microsoft.com/office/2019/extlst" xmlns:r="http://schemas.openxmlformats.org/officeDocument/2006/relationships" xmlns:m="http://schemas.openxmlformats.org/officeDocument/2006/math" xmlns:v="urn:schemas-microsoft-com:vml" xmlns:wp14="http://schemas.microsoft.com/office/word/2010/wordprocessingDrawing" xmlns:wp="http://schemas.openxmlformats.org/drawingml/2006/wordprocessingDrawing" xmlns:w10="urn:schemas-microsoft-com:office:word" xmlns:w="http://schemas.openxmlformats.org/wordprocessingml/2006/main" xmlns:w14="http://schemas.microsoft.com/office/word/2010/wordml" xmlns:w15="http://schemas.microsoft.com/office/word/2012/wordml" xmlns:w16cex="http://schemas.microsoft.com/office/word/2018/wordml/cex" xmlns:w16cid="http://schemas.microsoft.com/office/word/2016/wordml/cid" xmlns:w16="http://schemas.microsoft.com/office/word/2018/wordml" xmlns:w16du="http://schemas.microsoft.com/office/word/2023/wordml/word16du" xmlns:w16sdtdh="http://schemas.microsoft.com/office/word/2020/wordml/sdtdatahash" xmlns:w16sdtfl="http://schemas.microsoft.com/office/word/2024/wordml/sdtformatlock" xmlns:w16se="http://schemas.microsoft.com/office/word/2015/wordml/symex" xmlns:wpg="http://schemas.microsoft.com/office/word/2010/wordprocessingGroup" xmlns:wpi="http://schemas.microsoft.com/office/word/2010/wordprocessingInk" xmlns:wne="http://schemas.microsoft.com/office/word/2006/wordml" xmlns:wps="http://schemas.microsoft.com/office/word/2010/wordprocessingShape" mc:Ignorable="w14 w15 w16se w16cid w16 w16cex w16sdtdh w16sdtfl w16du wp14">
   <w:body>
-    <w:p>
-      <w:r>
-        <w:t>RÜCKGÄNGIG MACHEN Vor Lauf: log(Grüne/Linke)</w:t>
-      </w:r>
-      <w:r>
-        <w:br/>
-      </w:r>
-      <w:r>
-        <w:br/>
-      </w:r>
-      <w:r>
-        <w:t>Zu Besprechen</w:t>
-      </w:r>
-    </w:p>
-    <w:p>
-      <w:r>
-        <w:t>Ausdrucken? Binden?</w:t>
-      </w:r>
-      <w:r>
-        <w:br/>
-        <w:t xml:space="preserve">generelle Form? Zitierart </w:t>
-      </w:r>
-      <w:proofErr w:type="spellStart"/>
-      <w:r>
-        <w:t>etc</w:t>
-      </w:r>
-      <w:proofErr w:type="spellEnd"/>
-      <w:r>
-        <w:br/>
-      </w:r>
-      <w:proofErr w:type="spellStart"/>
-      <w:r>
-        <w:t>outlier</w:t>
-      </w:r>
-      <w:proofErr w:type="spellEnd"/>
-      <w:r>
-        <w:t xml:space="preserve"> entfernen?</w:t>
-      </w:r>
-      <w:r>
-        <w:br/>
-      </w:r>
-      <w:proofErr w:type="spellStart"/>
-      <w:r>
-        <w:t>osqp</w:t>
-      </w:r>
-      <w:proofErr w:type="spellEnd"/>
-      <w:r>
-        <w:t xml:space="preserve"> anwenden?</w:t>
-      </w:r>
-    </w:p>
-    <w:p>
-      <w:proofErr w:type="spellStart"/>
-      <w:r>
-        <w:t>Iter_max</w:t>
-      </w:r>
-      <w:proofErr w:type="spellEnd"/>
-      <w:r>
-        <w:t xml:space="preserve"> sagt nun 2</w:t>
-      </w:r>
-      <w:r>
-        <w:br/>
-      </w:r>
-    </w:p>
-    <w:p>
-      <w:r>
-        <w:t xml:space="preserve">Bootstrap dann nur über nicht </w:t>
-      </w:r>
-      <w:proofErr w:type="spellStart"/>
-      <w:r>
-        <w:t>outlier</w:t>
-      </w:r>
-      <w:proofErr w:type="spellEnd"/>
-      <w:r>
-        <w:t xml:space="preserve"> </w:t>
-      </w:r>
-      <w:proofErr w:type="spellStart"/>
-      <w:r>
-        <w:t>beobachtungen</w:t>
-      </w:r>
-      <w:proofErr w:type="spellEnd"/>
-      <w:r>
-        <w:t xml:space="preserve">? Hauptmodell ein zweites mal fitten ohne </w:t>
-      </w:r>
-      <w:proofErr w:type="spellStart"/>
-      <w:r>
-        <w:t>outlier</w:t>
-      </w:r>
-      <w:proofErr w:type="spellEnd"/>
-      <w:r>
-        <w:t xml:space="preserve">? </w:t>
-      </w:r>
-      <w:proofErr w:type="spellStart"/>
-      <w:r>
-        <w:t>Outlier</w:t>
-      </w:r>
-      <w:proofErr w:type="spellEnd"/>
-      <w:r>
-        <w:t xml:space="preserve"> identifizieren, bevor </w:t>
-      </w:r>
-      <w:proofErr w:type="spellStart"/>
-      <w:r>
-        <w:t>modell</w:t>
-      </w:r>
-      <w:proofErr w:type="spellEnd"/>
-      <w:r>
-        <w:t xml:space="preserve"> gefittet</w:t>
-      </w:r>
-    </w:p>
-    <w:p>
-      <w:proofErr w:type="spellStart"/>
-      <w:r>
-        <w:t>Iter_max</w:t>
-      </w:r>
-      <w:proofErr w:type="spellEnd"/>
-      <w:r>
-        <w:t xml:space="preserve">, modellannahmen, </w:t>
-      </w:r>
-      <w:r>
-        <w:t xml:space="preserve">Globale </w:t>
-      </w:r>
-      <w:proofErr w:type="spellStart"/>
-      <w:r>
-        <w:t>matrix</w:t>
-      </w:r>
-      <w:proofErr w:type="spellEnd"/>
-      <w:r>
-        <w:t xml:space="preserve">: </w:t>
-      </w:r>
-      <w:r>
-        <w:t>linke/grüne umsetzen</w:t>
-      </w:r>
-    </w:p>
-    <w:p/>
-    <w:p>
-      <w:r>
-        <w:t>TODO</w:t>
-      </w:r>
-    </w:p>
-    <w:p/>
-    <w:p>
-      <w:r>
-        <w:t>Zitieren überprüfen</w:t>
-      </w:r>
-    </w:p>
-    <w:p/>
-    <w:p>
-      <w:r>
-        <w:t>Variablen nicht nur mitteln sondern teils auch summieren wenn Strukturvariablen auf agg.schlüssel aggregiert werden</w:t>
-      </w:r>
-    </w:p>
-    <w:p/>
-    <w:p/>
-    <w:p>
-      <w:r>
-        <w:t>Unterschiede/Gemeinsamkeiten von einer Sache (z.b. zwei städte strukturvariablen unterschied von 1 variable, nslphom Ergebnis unterschied)</w:t>
-      </w:r>
-    </w:p>
-    <w:p/>
-    <w:p/>
-    <w:p>
-      <w:r>
-        <w:t>regressionen</w:t>
-      </w:r>
-      <w:r>
-        <w:t>: zufluss</w:t>
-      </w:r>
-      <w:r>
-        <w:t>modell. A</w:t>
-      </w:r>
-      <w:r>
-        <w:t>nteilsmodell</w:t>
-      </w:r>
-      <w:r>
-        <w:t xml:space="preserve"> etc wird erstellt. Muss entfernt werden vor abgabe</w:t>
-      </w:r>
-    </w:p>
-    <w:p/>
-    <w:p>
-      <w:r>
-        <w:t>Iter_max für andere samples nochmal betrachten</w:t>
-      </w:r>
-    </w:p>
-    <w:p/>
-    <w:p/>
     <w:p>
       <w:r>
         <w:t xml:space="preserve">Diskussion: </w:t>
@@ -205,8 +21,19 @@
       <w:proofErr w:type="spellEnd"/>
     </w:p>
     <w:p/>
-    <w:p/>
     <w:p>
+      <w:r>
+        <w:t>Vor Präsi</w:t>
+      </w:r>
+    </w:p>
+    <w:p>
+      <w:pPr>
+        <w:pStyle w:val="Listenabsatz"/>
+        <w:numPr>
+          <w:ilvl w:val="0"/>
+          <w:numId w:val="27"/>
+        </w:numPr>
+      </w:pPr>
       <w:proofErr w:type="spellStart"/>
       <w:r>
         <w:t>Nslphom</w:t>
@@ -219,113 +46,17 @@
     <w:p/>
     <w:p>
       <w:r>
-        <w:lastRenderedPageBreak/>
-        <w:t>Strukturvariablen deskriptiv (alter, varianz, …)</w:t>
+        <w:t>Vor Abgabe:</w:t>
       </w:r>
     </w:p>
     <w:p>
-      <w:r>
-        <w:t>Standardisierte Strukturvariablen Verteilung betrachten (interessanter wenn zentriert)</w:t>
-      </w:r>
-    </w:p>
-    <w:p/>
-    <w:p/>
-    <w:p/>
-    <w:p/>
-    <w:p>
-      <w:r>
-        <w:t xml:space="preserve">Variable erstellen: Grenze extremer, </w:t>
-      </w:r>
-      <w:proofErr w:type="spellStart"/>
-      <w:r>
-        <w:t>spatial</w:t>
-      </w:r>
-      <w:proofErr w:type="spellEnd"/>
-      <w:r>
-        <w:t xml:space="preserve"> </w:t>
-      </w:r>
-      <w:proofErr w:type="spellStart"/>
-      <w:r>
-        <w:t>effects</w:t>
-      </w:r>
-      <w:proofErr w:type="spellEnd"/>
-      <w:r>
-        <w:t xml:space="preserve"> mäßig</w:t>
-      </w:r>
-      <w:r>
-        <w:t xml:space="preserve"> </w:t>
-      </w:r>
-      <w:r>
-        <w:t>Distanz Wahlkreis zur Grenze</w:t>
-      </w:r>
-    </w:p>
-    <w:p/>
-    <w:p>
-      <w:r>
-        <w:t>Strukturvariablen</w:t>
-      </w:r>
-      <w:r>
-        <w:br/>
-        <w:t>Steuer: Vermögen, Einkommenssteuer</w:t>
-      </w:r>
-    </w:p>
-    <w:p>
-      <w:r>
-        <w:t>Unabhängige Kovariablen</w:t>
-      </w:r>
-    </w:p>
-    <w:p/>
-    <w:p/>
-    <w:p>
-      <w:r>
-        <w:t xml:space="preserve">Zitieren: </w:t>
-      </w:r>
-      <w:r>
-        <w:t xml:space="preserve">Pavía und Romero das Verfahren: Die </w:t>
-      </w:r>
-      <w:proofErr w:type="spellStart"/>
-      <w:r>
-        <w:t>nslphom</w:t>
-      </w:r>
-      <w:proofErr w:type="spellEnd"/>
-      <w:r>
-        <w:t>-Lösung gehört zur Iteration \(l^\</w:t>
-      </w:r>
-      <w:proofErr w:type="spellStart"/>
-      <w:r>
-        <w:t>ast</w:t>
-      </w:r>
-      <w:proofErr w:type="spellEnd"/>
-      <w:r>
-        <w:t xml:space="preserve">\), welche </w:t>
-      </w:r>
-      <w:proofErr w:type="spellStart"/>
-      <w:r>
-        <w:t>HETe</w:t>
-      </w:r>
-      <w:proofErr w:type="spellEnd"/>
-      <w:r>
-        <w:t xml:space="preserve"> minimiert; </w:t>
-      </w:r>
-      <w:proofErr w:type="spellStart"/>
-      <w:r>
-        <w:t>iter.max</w:t>
-      </w:r>
-      <w:proofErr w:type="spellEnd"/>
-      <w:r>
-        <w:t xml:space="preserve"> bzw. \(</w:t>
-      </w:r>
-      <w:proofErr w:type="spellStart"/>
-      <w:r>
-        <w:t>ns</w:t>
-      </w:r>
-      <w:proofErr w:type="spellEnd"/>
-      <w:r>
-        <w:t>\) begrenzt nur den Bereich, in dem danach gesucht wird.</w:t>
-      </w:r>
-    </w:p>
-    <w:p/>
-    <w:p>
+      <w:pPr>
+        <w:pStyle w:val="Listenabsatz"/>
+        <w:numPr>
+          <w:ilvl w:val="0"/>
+          <w:numId w:val="26"/>
+        </w:numPr>
+      </w:pPr>
       <w:r>
         <w:t xml:space="preserve">Überprüfen </w:t>
       </w:r>
@@ -375,274 +106,28 @@
       </w:r>
       <w:proofErr w:type="spellEnd"/>
     </w:p>
-    <w:p/>
-    <w:p/>
     <w:p>
+      <w:pPr>
+        <w:pStyle w:val="Listenabsatz"/>
+        <w:numPr>
+          <w:ilvl w:val="0"/>
+          <w:numId w:val="26"/>
+        </w:numPr>
+      </w:pPr>
       <w:r>
-        <w:t xml:space="preserve">Bei forschungsfrage auch methodische </w:t>
-      </w:r>
-      <w:proofErr w:type="spellStart"/>
-      <w:r>
-        <w:t>herangehensweise</w:t>
-      </w:r>
-      <w:proofErr w:type="spellEnd"/>
-      <w:r>
-        <w:t xml:space="preserve"> von </w:t>
-      </w:r>
-      <w:proofErr w:type="spellStart"/>
-      <w:r>
-        <w:t>interesse</w:t>
-      </w:r>
-      <w:proofErr w:type="spellEnd"/>
-    </w:p>
-    <w:p/>
-    <w:p>
-      <w:r>
-        <w:br/>
-      </w:r>
-      <w:r>
-        <w:br/>
-        <w:t>Zur Prüfung einer ausreichenden Iterationszahl wurde die duale Schätzung für</w:t>
+        <w:t>Zitieren überprüfen</w:t>
       </w:r>
     </w:p>
     <w:p>
+      <w:pPr>
+        <w:pStyle w:val="Listenabsatz"/>
+        <w:numPr>
+          <w:ilvl w:val="0"/>
+          <w:numId w:val="26"/>
+        </w:numPr>
+      </w:pPr>
       <w:r>
-        <w:t>den vollständigen ostdeutschen Datensatz zunächst über 80 Iterationen</w:t>
-      </w:r>
-    </w:p>
-    <w:p>
-      <w:r>
-        <w:t>fortgeführt. Für jede der beiden Schätzrichtungen wurde dabei der Verlauf des</w:t>
-      </w:r>
-    </w:p>
-    <w:p>
-      <w:proofErr w:type="spellStart"/>
-      <w:r>
-        <w:t>HETe</w:t>
-      </w:r>
-      <w:proofErr w:type="spellEnd"/>
-      <w:r>
-        <w:t xml:space="preserve"> betrachtet. Da \</w:t>
-      </w:r>
-      <w:proofErr w:type="spellStart"/>
-      <w:r>
-        <w:t>textit</w:t>
-      </w:r>
-      <w:proofErr w:type="spellEnd"/>
-      <w:r>
-        <w:t>{</w:t>
-      </w:r>
-      <w:proofErr w:type="spellStart"/>
-      <w:r>
-        <w:t>nslphom</w:t>
-      </w:r>
-      <w:proofErr w:type="spellEnd"/>
-      <w:r>
-        <w:t>} innerhalb der zugelassenen Iterationen</w:t>
-      </w:r>
-    </w:p>
-    <w:p>
-      <w:r>
-        <w:t xml:space="preserve">diejenige Lösung mit dem kleinsten </w:t>
-      </w:r>
-      <w:proofErr w:type="spellStart"/>
-      <w:r>
-        <w:t>HETe</w:t>
-      </w:r>
-      <w:proofErr w:type="spellEnd"/>
-      <w:r>
-        <w:t xml:space="preserve"> auswählt, dient</w:t>
-      </w:r>
-    </w:p>
-    <w:p>
-      <w:r>
-        <w:t>\</w:t>
-      </w:r>
-      <w:proofErr w:type="spellStart"/>
-      <w:r>
-        <w:t>texttt</w:t>
-      </w:r>
-      <w:proofErr w:type="spellEnd"/>
-      <w:r>
-        <w:t>{</w:t>
-      </w:r>
-      <w:proofErr w:type="spellStart"/>
-      <w:r>
-        <w:t>iter</w:t>
-      </w:r>
-      <w:proofErr w:type="spellEnd"/>
-      <w:r>
-        <w:t>\_</w:t>
-      </w:r>
-      <w:proofErr w:type="spellStart"/>
-      <w:r>
-        <w:t>max</w:t>
-      </w:r>
-      <w:proofErr w:type="spellEnd"/>
-      <w:r>
-        <w:t>} lediglich als Obergrenze des betrachteten</w:t>
-      </w:r>
-    </w:p>
-    <w:p>
-      <w:r>
-        <w:t>Iterationsbereichs \</w:t>
-      </w:r>
-      <w:proofErr w:type="spellStart"/>
-      <w:r>
-        <w:t>parencite</w:t>
-      </w:r>
-      <w:proofErr w:type="spellEnd"/>
-      <w:r>
-        <w:t>{PaviaRomero2024a,PaviaRomero2024b}.</w:t>
-      </w:r>
-    </w:p>
-    <w:p/>
-    <w:p>
-      <w:r>
-        <w:t xml:space="preserve">Die richtungsspezifischen </w:t>
-      </w:r>
-      <w:proofErr w:type="spellStart"/>
-      <w:r>
-        <w:t>HETe</w:t>
-      </w:r>
-      <w:proofErr w:type="spellEnd"/>
-      <w:r>
-        <w:t>-Minima werden innerhalb der ersten</w:t>
-      </w:r>
-    </w:p>
-    <w:p>
-      <w:r>
-        <w:lastRenderedPageBreak/>
-        <w:t>[XX] Iterationen erreicht und verändern sich bei einer weiteren Ausweitung</w:t>
-      </w:r>
-    </w:p>
-    <w:p>
-      <w:r>
-        <w:t>des Suchbereichs nicht mehr. Für die nachfolgenden Analysen wird daher</w:t>
-      </w:r>
-    </w:p>
-    <w:p>
-      <w:r>
-        <w:t>\</w:t>
-      </w:r>
-      <w:proofErr w:type="spellStart"/>
-      <w:r>
-        <w:t>texttt</w:t>
-      </w:r>
-      <w:proofErr w:type="spellEnd"/>
-      <w:r>
-        <w:t>{</w:t>
-      </w:r>
-      <w:proofErr w:type="spellStart"/>
-      <w:r>
-        <w:t>iter</w:t>
-      </w:r>
-      <w:proofErr w:type="spellEnd"/>
-      <w:r>
-        <w:t>\_</w:t>
-      </w:r>
-      <w:proofErr w:type="spellStart"/>
-      <w:r>
-        <w:t>max</w:t>
-      </w:r>
-      <w:proofErr w:type="spellEnd"/>
-      <w:r>
-        <w:t>}=[XX] festgelegt.</w:t>
-      </w:r>
-    </w:p>
-    <w:p/>
-    <w:p/>
-    <w:p>
-      <w:r>
-        <w:t xml:space="preserve">8.3 erster </w:t>
-      </w:r>
-      <w:proofErr w:type="spellStart"/>
-      <w:r>
-        <w:t>satz</w:t>
-      </w:r>
-      <w:proofErr w:type="spellEnd"/>
-      <w:r>
-        <w:t xml:space="preserve"> </w:t>
-      </w:r>
-      <w:proofErr w:type="spellStart"/>
-      <w:r>
-        <w:t>formatierung</w:t>
-      </w:r>
-      <w:proofErr w:type="spellEnd"/>
-    </w:p>
-    <w:p/>
-    <w:p/>
-    <w:p/>
-    <w:p>
-      <w:r>
-        <w:t xml:space="preserve">Ausreißer </w:t>
-      </w:r>
-      <w:proofErr w:type="spellStart"/>
-      <w:r>
-        <w:t>erklärung</w:t>
-      </w:r>
-      <w:proofErr w:type="spellEnd"/>
-      <w:r>
-        <w:t xml:space="preserve"> im </w:t>
-      </w:r>
-      <w:proofErr w:type="spellStart"/>
-      <w:r>
-        <w:t>anhang</w:t>
-      </w:r>
-      <w:proofErr w:type="spellEnd"/>
-    </w:p>
-    <w:p>
-      <w:r>
-        <w:t xml:space="preserve">Leave </w:t>
-      </w:r>
-      <w:proofErr w:type="spellStart"/>
-      <w:r>
-        <w:t>one</w:t>
-      </w:r>
-      <w:proofErr w:type="spellEnd"/>
-      <w:r>
-        <w:t xml:space="preserve"> out </w:t>
-      </w:r>
-      <w:proofErr w:type="spellStart"/>
-      <w:r>
-        <w:t>prüfung</w:t>
-      </w:r>
-      <w:proofErr w:type="spellEnd"/>
-      <w:r>
-        <w:t xml:space="preserve">: </w:t>
-      </w:r>
-      <w:proofErr w:type="spellStart"/>
-      <w:r>
-        <w:t>vorzeichenwechsel</w:t>
-      </w:r>
-      <w:proofErr w:type="spellEnd"/>
-      <w:r>
-        <w:t xml:space="preserve"> </w:t>
-      </w:r>
-      <w:r>
-        <w:t xml:space="preserve">nur bei im </w:t>
-      </w:r>
-      <w:proofErr w:type="spellStart"/>
-      <w:r>
-        <w:t>bootstrap</w:t>
-      </w:r>
-      <w:proofErr w:type="spellEnd"/>
-      <w:r>
-        <w:t xml:space="preserve"> nicht signifikanten </w:t>
-      </w:r>
-      <w:proofErr w:type="spellStart"/>
-      <w:r>
-        <w:t>koeffizienten</w:t>
-      </w:r>
-      <w:proofErr w:type="spellEnd"/>
-    </w:p>
-    <w:p/>
-    <w:p>
-      <w:r>
-        <w:t>Jan</w:t>
-      </w:r>
-      <w:r>
-        <w:t xml:space="preserve"> </w:t>
+        <w:t xml:space="preserve">Jan </w:t>
       </w:r>
       <w:proofErr w:type="spellStart"/>
       <w:r>
@@ -658,10 +143,7 @@
       </w:r>
       <w:proofErr w:type="spellEnd"/>
       <w:r>
-        <w:t xml:space="preserve"> </w:t>
-      </w:r>
-      <w:r>
-        <w:t xml:space="preserve">anschauen, </w:t>
+        <w:t xml:space="preserve"> anschauen, </w:t>
       </w:r>
       <w:proofErr w:type="spellStart"/>
       <w:r>
@@ -669,10 +151,7 @@
       </w:r>
       <w:proofErr w:type="spellEnd"/>
       <w:r>
-        <w:t xml:space="preserve"> anschauen</w:t>
-      </w:r>
-      <w:r>
-        <w:t xml:space="preserve">, </w:t>
+        <w:t xml:space="preserve"> anschauen, </w:t>
       </w:r>
       <w:proofErr w:type="spellStart"/>
       <w:r>
@@ -682,6 +161,39 @@
       <w:r>
         <w:t xml:space="preserve"> et al. Küchenhoff anschauen</w:t>
       </w:r>
+    </w:p>
+    <w:p>
+      <w:pPr>
+        <w:pStyle w:val="Listenabsatz"/>
+        <w:numPr>
+          <w:ilvl w:val="0"/>
+          <w:numId w:val="26"/>
+        </w:numPr>
+      </w:pPr>
+      <w:r>
+        <w:t xml:space="preserve">Linke/grüne: log() rückgängig in allen </w:t>
+      </w:r>
+      <w:proofErr w:type="spellStart"/>
+      <w:r>
+        <w:t>grafiken</w:t>
+      </w:r>
+      <w:proofErr w:type="spellEnd"/>
+      <w:r>
+        <w:t>?</w:t>
+      </w:r>
+    </w:p>
+    <w:p>
+      <w:pPr>
+        <w:pStyle w:val="Listenabsatz"/>
+        <w:numPr>
+          <w:ilvl w:val="0"/>
+          <w:numId w:val="26"/>
+        </w:numPr>
+      </w:pPr>
+    </w:p>
+    <w:p/>
+    <w:p/>
+    <w:p>
       <w:r>
         <w:br/>
       </w:r>
@@ -689,7 +201,7 @@
         <w:br/>
       </w:r>
       <w:r>
-        <w:t xml:space="preserve">Noch zu den korrelierten Kovariablen: Dass die korreliert sind, ist erstmal aus meiner Sicht kein statistisches Problem. Du musst bei der Interpretation dann eben wirklich drauf achten, die Koeffizienten immer gegeben die anderen Variablen (wie gehabt, ceteris paribus) zu interpretieren. Gleichzeitig klarstellen, dass manche zugrundeliegende Effekte eben gemeinsam interpretiert werden müssen (weiß nicht, ob das in deinem konkreten Fall irgendwo deterministisch zutrifft, aber wenn eine Erhöhung der einen Variable </w:t>
+        <w:t xml:space="preserve">Koeffizienten immer gegeben die anderen Variablen (wie gehabt, ceteris paribus) zu interpretieren. Gleichzeitig klarstellen, dass manche zugrundeliegende Effekte eben gemeinsam interpretiert werden müssen (weiß nicht, ob das in deinem konkreten Fall irgendwo deterministisch zutrifft, aber wenn eine Erhöhung der einen Variable </w:t>
       </w:r>
       <w:r>
         <w:rPr>
@@ -701,2242 +213,14 @@
         <w:t>immer</w:t>
       </w:r>
       <w:r>
-        <w:t xml:space="preserve"> mit einer Erhöhung/Verringerung einer anderen einhergehen würde, sollte man die Effekte gemeinsam nennen/interpretieren). Man könnte zusätzlich etwas in die Richtung sagen: "Da mehrere Kovariablen sich überschneidende Merkmale erfassen, spiegeln die einzelnen Koeffizienten Zusammenhänge mit der Variation jedes Prädiktors wider, die sich von den anderen im Modell berücksichtigten Variablen unterscheidet." Entsprechend sollte man bei zwei korrelierten Variablen auch nicht zu dem Schluss kommen, dass der Koeffizient einer der beiden Variablen den </w:t>
-      </w:r>
-      <w:r>
-        <w:rPr>
-          <w:i/>
-          <w:iCs/>
-        </w:rPr>
-        <w:t>gesamten</w:t>
-      </w:r>
-      <w:r>
-        <w:t xml:space="preserve"> Zusammenhang der Variablen oder den Anteil der Wählerwanderung darstellt, den diese Variable „allein erklärt“. Ein Teil des Effekts ist dann auch im </w:t>
-      </w:r>
-      <w:proofErr w:type="spellStart"/>
-      <w:r>
-        <w:t>koeffizienten</w:t>
-      </w:r>
-      <w:proofErr w:type="spellEnd"/>
-      <w:r>
-        <w:t xml:space="preserve"> der anderen Variable enthalten.</w:t>
-      </w:r>
-    </w:p>
-    <w:p>
-      <w:r>
-        <w:t>Hat übrigens nichts mit "</w:t>
-      </w:r>
-      <w:proofErr w:type="spellStart"/>
-      <w:r>
-        <w:t>no</w:t>
-      </w:r>
-      <w:proofErr w:type="spellEnd"/>
-      <w:r>
-        <w:t xml:space="preserve"> </w:t>
-      </w:r>
-      <w:proofErr w:type="spellStart"/>
-      <w:r>
-        <w:t>unobserved</w:t>
-      </w:r>
-      <w:proofErr w:type="spellEnd"/>
-      <w:r>
-        <w:t xml:space="preserve"> </w:t>
-      </w:r>
-      <w:proofErr w:type="spellStart"/>
-      <w:r>
-        <w:t>confounders</w:t>
-      </w:r>
-      <w:proofErr w:type="spellEnd"/>
-      <w:r>
-        <w:t xml:space="preserve">" zu tun, das waren die Überbleibsel von meiner lückenhaften Bildung im Bereich </w:t>
-      </w:r>
-      <w:proofErr w:type="spellStart"/>
-      <w:r>
-        <w:t>Causal</w:t>
-      </w:r>
-      <w:proofErr w:type="spellEnd"/>
-      <w:r>
-        <w:t xml:space="preserve"> </w:t>
-      </w:r>
-      <w:proofErr w:type="spellStart"/>
-      <w:r>
-        <w:t>Statistics</w:t>
-      </w:r>
-      <w:proofErr w:type="spellEnd"/>
-      <w:r>
-        <w:t>.</w:t>
+        <w:t xml:space="preserve"> mit einer Erhöhung/Verringerung einer anderen einhergehen würde, sollte man die Effekte gemeinsam nennen/interpretieren). </w:t>
       </w:r>
     </w:p>
     <w:p>
       <w:r>
         <w:br/>
       </w:r>
-      <w:r>
-        <w:br/>
-      </w:r>
     </w:p>
-    <w:p>
-      <w:r>
-        <w:t xml:space="preserve">Linke/grüne: log() </w:t>
-      </w:r>
-      <w:r>
-        <w:t>rückgängig</w:t>
-      </w:r>
-    </w:p>
-    <w:p/>
-    <w:p/>
-    <w:p>
-      <w:r>
-        <w:t xml:space="preserve">Welche grünen </w:t>
-      </w:r>
-      <w:proofErr w:type="spellStart"/>
-      <w:r>
-        <w:t>übergangswahrscheinlicheiten</w:t>
-      </w:r>
-      <w:proofErr w:type="spellEnd"/>
-      <w:r>
-        <w:t xml:space="preserve"> treten extrem auf bei welchen </w:t>
-      </w:r>
-      <w:proofErr w:type="spellStart"/>
-      <w:r>
-        <w:t>einheiten</w:t>
-      </w:r>
-      <w:proofErr w:type="spellEnd"/>
-      <w:r>
-        <w:t xml:space="preserve">? Was ist der </w:t>
-      </w:r>
-      <w:proofErr w:type="spellStart"/>
-      <w:r>
-        <w:t>zusammenhang</w:t>
-      </w:r>
-      <w:proofErr w:type="spellEnd"/>
-      <w:r>
-        <w:t xml:space="preserve"> dieser </w:t>
-      </w:r>
-      <w:proofErr w:type="spellStart"/>
-      <w:r>
-        <w:t>einheiten</w:t>
-      </w:r>
-      <w:proofErr w:type="spellEnd"/>
-      <w:r>
-        <w:t>?</w:t>
-      </w:r>
-      <w:r>
-        <w:br/>
-      </w:r>
-      <w:r>
-        <w:lastRenderedPageBreak/>
-        <w:br/>
-      </w:r>
-      <w:r>
-        <w:br/>
-      </w:r>
-      <w:r>
-        <w:br/>
-      </w:r>
-      <w:r>
-        <w:br/>
-      </w:r>
-      <w:r>
-        <w:t xml:space="preserve">mit confounder_ei_history.pdf  unter </w:t>
-      </w:r>
-      <w:proofErr w:type="spellStart"/>
-      <w:r>
-        <w:t>MeinMaterial</w:t>
-      </w:r>
-      <w:proofErr w:type="spellEnd"/>
-      <w:r>
-        <w:t xml:space="preserve">/Infomaterial auf </w:t>
-      </w:r>
-      <w:proofErr w:type="spellStart"/>
-      <w:r>
-        <w:t>seite</w:t>
-      </w:r>
-      <w:proofErr w:type="spellEnd"/>
-      <w:r>
-        <w:t xml:space="preserve"> 29 Historie auch </w:t>
-      </w:r>
-      <w:r>
-        <w:t>ABGLEICHEN</w:t>
-      </w:r>
-    </w:p>
-    <w:p/>
-    <w:p>
-      <w:r>
-        <w:t xml:space="preserve">in der </w:t>
-      </w:r>
-      <w:proofErr w:type="spellStart"/>
-      <w:r>
-        <w:t>einleitung</w:t>
-      </w:r>
-      <w:proofErr w:type="spellEnd"/>
-      <w:r>
-        <w:t xml:space="preserve"> die </w:t>
-      </w:r>
-      <w:proofErr w:type="spellStart"/>
-      <w:r>
-        <w:t>tabelle</w:t>
-      </w:r>
-      <w:proofErr w:type="spellEnd"/>
-      <w:r>
-        <w:t xml:space="preserve"> von </w:t>
-      </w:r>
-      <w:proofErr w:type="spellStart"/>
-      <w:r>
-        <w:t>parteien</w:t>
-      </w:r>
-      <w:proofErr w:type="spellEnd"/>
-      <w:r>
-        <w:t xml:space="preserve"> am </w:t>
-      </w:r>
-      <w:proofErr w:type="spellStart"/>
-      <w:r>
-        <w:t>rand</w:t>
-      </w:r>
-      <w:proofErr w:type="spellEnd"/>
-      <w:r>
-        <w:t xml:space="preserve"> und </w:t>
-      </w:r>
-      <w:proofErr w:type="spellStart"/>
-      <w:r>
-        <w:t>fragezeichen</w:t>
-      </w:r>
-      <w:proofErr w:type="spellEnd"/>
-      <w:r>
-        <w:t xml:space="preserve"> zu den </w:t>
-      </w:r>
-      <w:proofErr w:type="spellStart"/>
-      <w:r>
-        <w:t>übergängen</w:t>
-      </w:r>
-      <w:proofErr w:type="spellEnd"/>
-      <w:r>
-        <w:t xml:space="preserve"> </w:t>
-      </w:r>
-    </w:p>
-    <w:p/>
-    <w:p>
-      <w:r>
-        <w:t xml:space="preserve">noch ausführen: </w:t>
-      </w:r>
-      <w:proofErr w:type="spellStart"/>
-      <w:r>
-        <w:t>options</w:t>
-      </w:r>
-      <w:proofErr w:type="spellEnd"/>
-      <w:r>
-        <w:t>(</w:t>
-      </w:r>
-    </w:p>
-    <w:p>
-      <w:r>
-        <w:t xml:space="preserve">  </w:t>
-      </w:r>
-      <w:proofErr w:type="spellStart"/>
-      <w:r>
-        <w:t>waehlendenwanderung.speed_comparison_osqp_local_solver</w:t>
-      </w:r>
-      <w:proofErr w:type="spellEnd"/>
-      <w:r>
-        <w:t xml:space="preserve"> = "</w:t>
-      </w:r>
-      <w:proofErr w:type="spellStart"/>
-      <w:r>
-        <w:t>lp_solve</w:t>
-      </w:r>
-      <w:proofErr w:type="spellEnd"/>
-      <w:r>
-        <w:t>",</w:t>
-      </w:r>
-    </w:p>
-    <w:p>
-      <w:r>
-        <w:t xml:space="preserve">  </w:t>
-      </w:r>
-      <w:proofErr w:type="spellStart"/>
-      <w:r>
-        <w:t>waehlendenwanderung.speed_comparison_name</w:t>
-      </w:r>
-      <w:proofErr w:type="spellEnd"/>
-      <w:r>
-        <w:t xml:space="preserve"> =</w:t>
-      </w:r>
-    </w:p>
-    <w:p>
-      <w:r>
-        <w:t xml:space="preserve">    "</w:t>
-      </w:r>
-      <w:proofErr w:type="spellStart"/>
-      <w:r>
-        <w:t>ost_linke_gruene_hybrid_vs_nslphom_dual</w:t>
-      </w:r>
-      <w:proofErr w:type="spellEnd"/>
-      <w:r>
-        <w:t>",</w:t>
-      </w:r>
-    </w:p>
-    <w:p>
-      <w:r>
-        <w:t xml:space="preserve">  </w:t>
-      </w:r>
-      <w:proofErr w:type="spellStart"/>
-      <w:r>
-        <w:t>waehlendenwanderung.speed_comparison_iter_max</w:t>
-      </w:r>
-      <w:proofErr w:type="spellEnd"/>
-      <w:r>
-        <w:t xml:space="preserve"> = GEWAEHLT,</w:t>
-      </w:r>
-    </w:p>
-    <w:p>
-      <w:pPr>
-        <w:rPr>
-          <w:lang w:val="en-US"/>
-        </w:rPr>
-      </w:pPr>
-      <w:r>
-        <w:t xml:space="preserve">  </w:t>
-      </w:r>
-      <w:r>
-        <w:rPr>
-          <w:lang w:val="en-US"/>
-        </w:rPr>
-        <w:t>waehlendenwanderung.speed_comparison_repetitions = 3L,</w:t>
-      </w:r>
-    </w:p>
-    <w:p>
-      <w:pPr>
-        <w:rPr>
-          <w:lang w:val="en-US"/>
-        </w:rPr>
-      </w:pPr>
-      <w:r>
-        <w:rPr>
-          <w:lang w:val="en-US"/>
-        </w:rPr>
-        <w:t xml:space="preserve">  waehlendenwanderung.speed_comparison_selection = "all",</w:t>
-      </w:r>
-    </w:p>
-    <w:p>
-      <w:pPr>
-        <w:rPr>
-          <w:lang w:val="en-US"/>
-        </w:rPr>
-      </w:pPr>
-      <w:r>
-        <w:rPr>
-          <w:lang w:val="en-US"/>
-        </w:rPr>
-        <w:t xml:space="preserve">  waehlendenwanderung.speed_comparison_units = Inf</w:t>
-      </w:r>
-    </w:p>
-    <w:p>
-      <w:pPr>
-        <w:rPr>
-          <w:lang w:val="en-US"/>
-        </w:rPr>
-      </w:pPr>
-      <w:r>
-        <w:rPr>
-          <w:lang w:val="en-US"/>
-        </w:rPr>
-        <w:t>)</w:t>
-      </w:r>
-    </w:p>
-    <w:p>
-      <w:pPr>
-        <w:rPr>
-          <w:lang w:val="en-US"/>
-        </w:rPr>
-      </w:pPr>
-    </w:p>
-    <w:p>
-      <w:pPr>
-        <w:rPr>
-          <w:lang w:val="en-US"/>
-        </w:rPr>
-      </w:pPr>
-      <w:r>
-        <w:rPr>
-          <w:lang w:val="en-US"/>
-        </w:rPr>
-        <w:t>source(</w:t>
-      </w:r>
-    </w:p>
-    <w:p>
-      <w:pPr>
-        <w:rPr>
-          <w:lang w:val="en-US"/>
-        </w:rPr>
-      </w:pPr>
-      <w:r>
-        <w:rPr>
-          <w:lang w:val="en-US"/>
-        </w:rPr>
-        <w:t xml:space="preserve">  "Scripts/17_compare_nslphom_dual_speed.R",</w:t>
-      </w:r>
-    </w:p>
-    <w:p>
-      <w:r>
-        <w:rPr>
-          <w:lang w:val="en-US"/>
-        </w:rPr>
-        <w:t xml:space="preserve">  </w:t>
-      </w:r>
-      <w:proofErr w:type="spellStart"/>
-      <w:r>
-        <w:t>encoding</w:t>
-      </w:r>
-      <w:proofErr w:type="spellEnd"/>
-      <w:r>
-        <w:t xml:space="preserve"> = "UTF-8"</w:t>
-      </w:r>
-    </w:p>
-    <w:p>
-      <w:r>
-        <w:t>)</w:t>
-      </w:r>
-      <w:r>
-        <w:br/>
-      </w:r>
-      <w:r>
-        <w:br/>
-      </w:r>
-      <w:r>
-        <w:rPr>
-          <w:sz w:val="16"/>
-          <w:szCs w:val="16"/>
-        </w:rPr>
-        <w:br/>
-      </w:r>
-      <w:r>
-        <w:rPr>
-          <w:sz w:val="16"/>
-          <w:szCs w:val="16"/>
-        </w:rPr>
-        <w:br/>
-      </w:r>
-      <w:r>
-        <w:br/>
-      </w:r>
-      <w:r>
-        <w:br/>
-      </w:r>
-      <w:r>
-        <w:t xml:space="preserve">Die Verwendung von King-Schätzern als abhängige Variablen in Regressionsanalysen führt im Allgemeinen zu inkonsistenten Ergebnissen. </w:t>
-      </w:r>
-    </w:p>
-    <w:p>
-      <w:pPr>
-        <w:rPr>
-          <w:b/>
-          <w:bCs/>
-        </w:rPr>
-      </w:pPr>
-      <w:r>
-        <w:rPr>
-          <w:b/>
-          <w:bCs/>
-        </w:rPr>
-        <w:t>Kernpunkte der Arbeit von Herron und Shotts (2003)</w:t>
-      </w:r>
-    </w:p>
-    <w:p>
-      <w:pPr>
-        <w:numPr>
-          <w:ilvl w:val="0"/>
-          <w:numId w:val="22"/>
-        </w:numPr>
-      </w:pPr>
-      <w:r>
-        <w:rPr>
-          <w:b/>
-          <w:bCs/>
-        </w:rPr>
-        <w:t>Das Problem (EI-R):</w:t>
-      </w:r>
-      <w:r>
-        <w:t xml:space="preserve"> Forscher nutzen oft Punktschätzungen aus der ökologischen Inferenz (nach Gary King) als abhängige Variablen in einer zweiten linearen Regression.</w:t>
-      </w:r>
-    </w:p>
-    <w:p>
-      <w:pPr>
-        <w:numPr>
-          <w:ilvl w:val="0"/>
-          <w:numId w:val="22"/>
-        </w:numPr>
-      </w:pPr>
-      <w:r>
-        <w:rPr>
-          <w:b/>
-          <w:bCs/>
-        </w:rPr>
-        <w:t>Inkonsistenz:</w:t>
-      </w:r>
-      <w:r>
-        <w:t xml:space="preserve"> Diese Methode liefert inkonsistente Schätzer für die Regressionskoeffizienten.</w:t>
-      </w:r>
-    </w:p>
-    <w:p>
-      <w:pPr>
-        <w:numPr>
-          <w:ilvl w:val="0"/>
-          <w:numId w:val="22"/>
-        </w:numPr>
-      </w:pPr>
-      <w:r>
-        <w:rPr>
-          <w:b/>
-          <w:bCs/>
-        </w:rPr>
-        <w:t>Ursache:</w:t>
-      </w:r>
-      <w:r>
-        <w:t xml:space="preserve"> Die Punktschätzungen aus der ersten Stufe enthalten Messfehler, die systematisch mit den wahren (aber unbeobachteten) Größen korreliert sind.</w:t>
-      </w:r>
-    </w:p>
-    <w:p>
-      <w:pPr>
-        <w:numPr>
-          <w:ilvl w:val="0"/>
-          <w:numId w:val="22"/>
-        </w:numPr>
-      </w:pPr>
-      <w:r>
-        <w:rPr>
-          <w:b/>
-          <w:bCs/>
-        </w:rPr>
-        <w:lastRenderedPageBreak/>
-        <w:t>Verzerrung:</w:t>
-      </w:r>
-      <w:r>
-        <w:t xml:space="preserve"> Selbst wenn alle Annahmen von Kings Methode erfüllt sind, leidet die zweite Stufe unter Verzerrungen (wie Dämpfungs- oder Vorzeichenverzerrungen</w:t>
-      </w:r>
-    </w:p>
-    <w:p>
-      <w:r>
-        <w:br/>
-      </w:r>
-      <w:r>
-        <w:br/>
-      </w:r>
-      <w:r>
-        <w:br/>
-      </w:r>
-      <w:r>
-        <w:br/>
-      </w:r>
-      <w:r>
-        <w:br/>
-      </w:r>
-      <w:r>
-        <w:br/>
-      </w:r>
-      <w:r>
-        <w:br/>
-      </w:r>
-      <w:r>
-        <w:t xml:space="preserve">Herron und </w:t>
-      </w:r>
-      <w:proofErr w:type="spellStart"/>
-      <w:r>
-        <w:t>shotts</w:t>
-      </w:r>
-      <w:proofErr w:type="spellEnd"/>
-      <w:r>
-        <w:t xml:space="preserve"> 2003 (</w:t>
-      </w:r>
-      <w:proofErr w:type="spellStart"/>
-      <w:r>
-        <w:t>regression</w:t>
-      </w:r>
-      <w:proofErr w:type="spellEnd"/>
-      <w:r>
-        <w:t xml:space="preserve"> auf geschätzten variablen verzerrt.) meine </w:t>
-      </w:r>
-      <w:proofErr w:type="spellStart"/>
-      <w:r>
-        <w:t>simulation</w:t>
-      </w:r>
-      <w:proofErr w:type="spellEnd"/>
-      <w:r>
-        <w:t xml:space="preserve"> auswerten/überprüfen:</w:t>
-      </w:r>
-      <w:r>
-        <w:br/>
-      </w:r>
-      <w:r>
-        <w:t xml:space="preserve">Für </w:t>
-      </w:r>
-      <w:r>
-        <w:rPr>
-          <w:b/>
-          <w:bCs/>
-        </w:rPr>
-        <w:t>deine konkrete Methode</w:t>
-      </w:r>
-      <w:r>
-        <w:t xml:space="preserve"> wäre eine Simulation sogar sehr aussagekräftig: Du erzeugst Übergangswahrscheinlichkeiten mit einem </w:t>
-      </w:r>
-      <w:r>
-        <w:rPr>
-          <w:b/>
-          <w:bCs/>
-        </w:rPr>
-        <w:t>bekannten</w:t>
-      </w:r>
-      <w:r>
-        <w:t xml:space="preserve"> Strukturzusammenhang, z. B.</w:t>
-      </w:r>
-    </w:p>
-    <w:p>
-      <m:oMathPara>
-        <m:oMath>
-          <m:sSub>
-            <m:sSubPr>
-              <m:ctrlPr>
-                <w:rPr>
-                  <w:rFonts w:ascii="Cambria Math" w:hAnsi="Cambria Math"/>
-                </w:rPr>
-              </m:ctrlPr>
-            </m:sSubPr>
-            <m:e>
-              <m:r>
-                <w:rPr>
-                  <w:rFonts w:ascii="Cambria Math" w:hAnsi="Cambria Math"/>
-                </w:rPr>
-                <m:t>p</m:t>
-              </m:r>
-            </m:e>
-            <m:sub>
-              <m:r>
-                <w:rPr>
-                  <w:rFonts w:ascii="Cambria Math" w:hAnsi="Cambria Math"/>
-                </w:rPr>
-                <m:t>i</m:t>
-              </m:r>
-            </m:sub>
-          </m:sSub>
-          <m:r>
-            <w:rPr>
-              <w:rFonts w:ascii="Cambria Math" w:hAnsi="Cambria Math"/>
-            </w:rPr>
-            <m:t>=α+β</m:t>
-          </m:r>
-          <m:sSub>
-            <m:sSubPr>
-              <m:ctrlPr>
-                <w:rPr>
-                  <w:rFonts w:ascii="Cambria Math" w:hAnsi="Cambria Math"/>
-                </w:rPr>
-              </m:ctrlPr>
-            </m:sSubPr>
-            <m:e>
-              <m:r>
-                <w:rPr>
-                  <w:rFonts w:ascii="Cambria Math" w:hAnsi="Cambria Math"/>
-                </w:rPr>
-                <m:t>X</m:t>
-              </m:r>
-            </m:e>
-            <m:sub>
-              <m:r>
-                <w:rPr>
-                  <w:rFonts w:ascii="Cambria Math" w:hAnsi="Cambria Math"/>
-                </w:rPr>
-                <m:t>i</m:t>
-              </m:r>
-            </m:sub>
-          </m:sSub>
-          <m:r>
-            <w:rPr>
-              <w:rFonts w:ascii="Cambria Math" w:hAnsi="Cambria Math"/>
-            </w:rPr>
-            <m:t>,</m:t>
-          </m:r>
-          <m:r>
-            <m:rPr>
-              <m:sty m:val="p"/>
-            </m:rPr>
-            <w:br/>
-          </m:r>
-        </m:oMath>
-      </m:oMathPara>
-    </w:p>
-    <w:p>
-      <w:r>
-        <w:t xml:space="preserve">erzeugst daraus Wahlränder, lässt </w:t>
-      </w:r>
-      <w:proofErr w:type="spellStart"/>
-      <w:r>
-        <w:t>nslphom_dual</w:t>
-      </w:r>
-      <w:proofErr w:type="spellEnd"/>
-      <w:r>
-        <w:t xml:space="preserve"> die Übergänge rekonstruieren und schätzt anschließend</w:t>
-      </w:r>
-    </w:p>
-    <w:p>
-      <m:oMathPara>
-        <m:oMath>
-          <m:sSub>
-            <m:sSubPr>
-              <m:ctrlPr>
-                <w:rPr>
-                  <w:rFonts w:ascii="Cambria Math" w:hAnsi="Cambria Math"/>
-                </w:rPr>
-              </m:ctrlPr>
-            </m:sSubPr>
-            <m:e>
-              <m:acc>
-                <m:accPr>
-                  <m:ctrlPr>
-                    <w:rPr>
-                      <w:rFonts w:ascii="Cambria Math" w:hAnsi="Cambria Math"/>
-                    </w:rPr>
-                  </m:ctrlPr>
-                </m:accPr>
-                <m:e>
-                  <m:r>
-                    <w:rPr>
-                      <w:rFonts w:ascii="Cambria Math" w:hAnsi="Cambria Math"/>
-                    </w:rPr>
-                    <m:t>p</m:t>
-                  </m:r>
-                </m:e>
-              </m:acc>
-            </m:e>
-            <m:sub>
-              <m:r>
-                <w:rPr>
-                  <w:rFonts w:ascii="Cambria Math" w:hAnsi="Cambria Math"/>
-                </w:rPr>
-                <m:t>i</m:t>
-              </m:r>
-            </m:sub>
-          </m:sSub>
-          <m:r>
-            <w:rPr>
-              <w:rFonts w:ascii="Cambria Math" w:hAnsi="Cambria Math"/>
-            </w:rPr>
-            <m:t>∼</m:t>
-          </m:r>
-          <m:sSub>
-            <m:sSubPr>
-              <m:ctrlPr>
-                <w:rPr>
-                  <w:rFonts w:ascii="Cambria Math" w:hAnsi="Cambria Math"/>
-                </w:rPr>
-              </m:ctrlPr>
-            </m:sSubPr>
-            <m:e>
-              <m:r>
-                <w:rPr>
-                  <w:rFonts w:ascii="Cambria Math" w:hAnsi="Cambria Math"/>
-                </w:rPr>
-                <m:t>X</m:t>
-              </m:r>
-            </m:e>
-            <m:sub>
-              <m:r>
-                <w:rPr>
-                  <w:rFonts w:ascii="Cambria Math" w:hAnsi="Cambria Math"/>
-                </w:rPr>
-                <m:t>i</m:t>
-              </m:r>
-            </m:sub>
-          </m:sSub>
-          <m:r>
-            <w:rPr>
-              <w:rFonts w:ascii="Cambria Math" w:hAnsi="Cambria Math"/>
-            </w:rPr>
-            <m:t>.</m:t>
-          </m:r>
-          <m:r>
-            <m:rPr>
-              <m:sty m:val="p"/>
-            </m:rPr>
-            <w:br/>
-          </m:r>
-        </m:oMath>
-      </m:oMathPara>
-    </w:p>
-    <w:p>
-      <w:r>
-        <w:t>Dann vergleichst du</w:t>
-      </w:r>
-    </w:p>
-    <w:p>
-      <m:oMathPara>
-        <m:oMath>
-          <m:sSub>
-            <m:sSubPr>
-              <m:ctrlPr>
-                <w:rPr>
-                  <w:rFonts w:ascii="Cambria Math" w:hAnsi="Cambria Math"/>
-                </w:rPr>
-              </m:ctrlPr>
-            </m:sSubPr>
-            <m:e>
-              <m:acc>
-                <m:accPr>
-                  <m:ctrlPr>
-                    <w:rPr>
-                      <w:rFonts w:ascii="Cambria Math" w:hAnsi="Cambria Math"/>
-                    </w:rPr>
-                  </m:ctrlPr>
-                </m:accPr>
-                <m:e>
-                  <m:r>
-                    <w:rPr>
-                      <w:rFonts w:ascii="Cambria Math" w:hAnsi="Cambria Math"/>
-                    </w:rPr>
-                    <m:t>β</m:t>
-                  </m:r>
-                </m:e>
-              </m:acc>
-            </m:e>
-            <m:sub>
-              <m:r>
-                <m:rPr>
-                  <m:nor/>
-                </m:rPr>
-                <m:t>Second Stage</m:t>
-              </m:r>
-            </m:sub>
-          </m:sSub>
-          <m:r>
-            <w:rPr>
-              <w:rFonts w:ascii="Cambria Math" w:hAnsi="Cambria Math"/>
-            </w:rPr>
-            <m:t> </m:t>
-          </m:r>
-          <m:r>
-            <m:rPr>
-              <m:nor/>
-            </m:rPr>
-            <m:t>mit</m:t>
-          </m:r>
-          <m:r>
-            <w:rPr>
-              <w:rFonts w:ascii="Cambria Math" w:hAnsi="Cambria Math"/>
-            </w:rPr>
-            <m:t> </m:t>
-          </m:r>
-          <m:sSub>
-            <m:sSubPr>
-              <m:ctrlPr>
-                <w:rPr>
-                  <w:rFonts w:ascii="Cambria Math" w:hAnsi="Cambria Math"/>
-                </w:rPr>
-              </m:ctrlPr>
-            </m:sSubPr>
-            <m:e>
-              <m:r>
-                <w:rPr>
-                  <w:rFonts w:ascii="Cambria Math" w:hAnsi="Cambria Math"/>
-                </w:rPr>
-                <m:t>β</m:t>
-              </m:r>
-            </m:e>
-            <m:sub>
-              <m:r>
-                <m:rPr>
-                  <m:nor/>
-                </m:rPr>
-                <m:t>wahr</m:t>
-              </m:r>
-            </m:sub>
-          </m:sSub>
-          <m:r>
-            <w:rPr>
-              <w:rFonts w:ascii="Cambria Math" w:hAnsi="Cambria Math"/>
-            </w:rPr>
-            <m:t>.</m:t>
-          </m:r>
-          <m:r>
-            <m:rPr>
-              <m:sty m:val="p"/>
-            </m:rPr>
-            <w:br/>
-          </m:r>
-        </m:oMath>
-      </m:oMathPara>
-    </w:p>
-    <w:p>
-      <w:r>
-        <w:t xml:space="preserve">Wenn beispielsweise </w:t>
-      </w:r>
-      <m:oMath>
-        <m:sSub>
-          <m:sSubPr>
-            <m:ctrlPr>
-              <w:rPr>
-                <w:rFonts w:ascii="Cambria Math" w:hAnsi="Cambria Math"/>
-              </w:rPr>
-            </m:ctrlPr>
-          </m:sSubPr>
-          <m:e>
-            <m:r>
-              <w:rPr>
-                <w:rFonts w:ascii="Cambria Math" w:hAnsi="Cambria Math"/>
-              </w:rPr>
-              <m:t>β</m:t>
-            </m:r>
-          </m:e>
-          <m:sub>
-            <m:r>
-              <m:rPr>
-                <m:nor/>
-              </m:rPr>
-              <m:t>wahr</m:t>
-            </m:r>
-          </m:sub>
-        </m:sSub>
-        <m:r>
-          <w:rPr>
-            <w:rFonts w:ascii="Cambria Math" w:hAnsi="Cambria Math"/>
-          </w:rPr>
-          <m:t>=0,05</m:t>
-        </m:r>
-      </m:oMath>
-      <w:r>
-        <w:t xml:space="preserve">und du über viele Simulationen im Mittel nur </w:t>
-      </w:r>
-      <m:oMath>
-        <m:r>
-          <w:rPr>
-            <w:rFonts w:ascii="Cambria Math" w:hAnsi="Cambria Math"/>
-          </w:rPr>
-          <m:t>0,025</m:t>
-        </m:r>
-      </m:oMath>
-      <w:r>
-        <w:t xml:space="preserve">erhältst, hättest du </w:t>
-      </w:r>
-      <w:r>
-        <w:rPr>
-          <w:b/>
-          <w:bCs/>
-        </w:rPr>
-        <w:t xml:space="preserve">für dein konkretes </w:t>
-      </w:r>
-      <w:proofErr w:type="spellStart"/>
-      <w:r>
-        <w:rPr>
-          <w:b/>
-          <w:bCs/>
-        </w:rPr>
-        <w:t>nslphom→Regression-Verfahren</w:t>
-      </w:r>
-      <w:proofErr w:type="spellEnd"/>
-      <w:r>
-        <w:t xml:space="preserve"> Evidenz für Attenuation. Wenn du im Mittel </w:t>
-      </w:r>
-      <m:oMath>
-        <m:r>
-          <w:rPr>
-            <w:rFonts w:ascii="Cambria Math" w:hAnsi="Cambria Math"/>
-          </w:rPr>
-          <m:t>0,05</m:t>
-        </m:r>
-      </m:oMath>
-      <w:r>
-        <w:t>zurückbekommst, wäre genau dieser Bias trotz unperfekter lokaler Übergangsschätzungen nicht vorhanden.</w:t>
-      </w:r>
-    </w:p>
-    <w:p/>
-    <w:p/>
-    <w:p>
-      <w:r>
-        <w:t xml:space="preserve">Ins homogenitätsannahmen </w:t>
-      </w:r>
-      <w:proofErr w:type="spellStart"/>
-      <w:r>
-        <w:t>kapitel</w:t>
-      </w:r>
-      <w:proofErr w:type="spellEnd"/>
-      <w:r>
-        <w:t>:</w:t>
-      </w:r>
-      <w:r>
-        <w:br/>
-        <w:t>Auch \</w:t>
-      </w:r>
-      <w:proofErr w:type="spellStart"/>
-      <w:r>
-        <w:t>textcite</w:t>
-      </w:r>
-      <w:proofErr w:type="spellEnd"/>
-      <w:r>
-        <w:t>{ChoGaines2004} zeigen am Beispiel von $2\times2$-Problemen,</w:t>
-      </w:r>
-    </w:p>
-    <w:p>
-      <w:r>
-        <w:t>dass selbst scheinbar informative Aggregatdaten irreführende ökologische</w:t>
-      </w:r>
-    </w:p>
-    <w:p>
-      <w:r>
-        <w:t>Schätzungen erzeugen können, wenn die lokalen Übergangsparameter systematisch</w:t>
-      </w:r>
-    </w:p>
-    <w:p>
-      <w:r>
-        <w:t>mit den beobachteten Randverteilungen zusammenhängen.</w:t>
-      </w:r>
-    </w:p>
-    <w:p/>
-    <w:p>
-      <w:r>
-        <w:br/>
-      </w:r>
-      <w:r>
-        <w:br/>
-      </w:r>
-      <w:proofErr w:type="spellStart"/>
-      <w:r>
-        <w:t>iter_max</w:t>
-      </w:r>
-      <w:proofErr w:type="spellEnd"/>
-      <w:r>
-        <w:t xml:space="preserve"> teil: größeres </w:t>
-      </w:r>
-      <w:proofErr w:type="spellStart"/>
-      <w:r>
-        <w:t>iter_max</w:t>
-      </w:r>
-      <w:proofErr w:type="spellEnd"/>
-      <w:r>
-        <w:t xml:space="preserve"> gleich höheres </w:t>
-      </w:r>
-      <w:proofErr w:type="spellStart"/>
-      <w:r>
-        <w:t>overfitting</w:t>
-      </w:r>
-      <w:proofErr w:type="spellEnd"/>
-      <w:r>
-        <w:t xml:space="preserve"> </w:t>
-      </w:r>
-      <w:proofErr w:type="spellStart"/>
-      <w:r>
-        <w:t>problem</w:t>
-      </w:r>
-      <w:proofErr w:type="spellEnd"/>
-      <w:r>
-        <w:t>?</w:t>
-      </w:r>
-    </w:p>
-    <w:p/>
-    <w:p/>
-    <w:p/>
-    <w:p/>
-    <w:p/>
-    <w:p/>
-    <w:p/>
-    <w:p/>
-    <w:p/>
-    <w:p/>
-    <w:p/>
-    <w:p/>
-    <w:p/>
-    <w:p/>
-    <w:p/>
-    <w:p/>
-    <w:p/>
-    <w:p>
-      <w:r>
-        <w:t xml:space="preserve">ITER_MAX </w:t>
-      </w:r>
-      <w:proofErr w:type="spellStart"/>
-      <w:r>
-        <w:t>begründung</w:t>
-      </w:r>
-      <w:proofErr w:type="spellEnd"/>
-      <w:r>
-        <w:t xml:space="preserve"> </w:t>
-      </w:r>
-      <w:proofErr w:type="spellStart"/>
-      <w:r>
-        <w:t>etc</w:t>
-      </w:r>
-      <w:proofErr w:type="spellEnd"/>
-      <w:r>
-        <w:br/>
-      </w:r>
-      <w:r>
-        <w:t xml:space="preserve">Der entscheidende Punkt ist: </w:t>
-      </w:r>
-      <w:proofErr w:type="spellStart"/>
-      <w:r>
-        <w:rPr>
-          <w:b/>
-          <w:bCs/>
-        </w:rPr>
-        <w:t>nslphom_dual</w:t>
-      </w:r>
-      <w:proofErr w:type="spellEnd"/>
-      <w:r>
-        <w:rPr>
-          <w:b/>
-          <w:bCs/>
-        </w:rPr>
-        <w:t xml:space="preserve"> minimiert nicht den </w:t>
-      </w:r>
-      <w:proofErr w:type="spellStart"/>
-      <w:r>
-        <w:rPr>
-          <w:b/>
-          <w:bCs/>
-        </w:rPr>
-        <w:t>HETe</w:t>
-      </w:r>
-      <w:proofErr w:type="spellEnd"/>
-      <w:r>
-        <w:rPr>
-          <w:b/>
-          <w:bCs/>
-        </w:rPr>
-        <w:t xml:space="preserve"> der bereits kombinierten dualen Matrix über alle Iterationspaare.</w:t>
-      </w:r>
-      <w:r>
-        <w:t xml:space="preserve"> Stattdessen läuft die Auswahl zweistufig:</w:t>
-      </w:r>
-    </w:p>
-    <w:p>
-      <w:pPr>
-        <w:numPr>
-          <w:ilvl w:val="0"/>
-          <w:numId w:val="23"/>
-        </w:numPr>
-      </w:pPr>
-      <w:r>
-        <w:t xml:space="preserve">Für die Richtung \(X\to Y\) wird innerhalb der zugelassenen Iterationen diejenige </w:t>
-      </w:r>
-      <w:proofErr w:type="spellStart"/>
-      <w:r>
-        <w:t>nslphom</w:t>
-      </w:r>
-      <w:proofErr w:type="spellEnd"/>
-      <w:r>
-        <w:t xml:space="preserve">-Lösung gewählt, deren richtungsspezifischer </w:t>
-      </w:r>
-      <w:proofErr w:type="spellStart"/>
-      <w:r>
-        <w:t>HETe</w:t>
-      </w:r>
-      <w:proofErr w:type="spellEnd"/>
-      <w:r>
-        <w:t xml:space="preserve"> minimal ist.</w:t>
-      </w:r>
-    </w:p>
-    <w:p>
-      <w:pPr>
-        <w:numPr>
-          <w:ilvl w:val="0"/>
-          <w:numId w:val="23"/>
-        </w:numPr>
-      </w:pPr>
-      <w:r>
-        <w:t>Für \(Y\to X\) geschieht dasselbe separat.</w:t>
-      </w:r>
-    </w:p>
-    <w:p>
-      <w:pPr>
-        <w:numPr>
-          <w:ilvl w:val="0"/>
-          <w:numId w:val="23"/>
-        </w:numPr>
-      </w:pPr>
-      <w:r>
-        <w:t xml:space="preserve">Erst </w:t>
-      </w:r>
-      <w:r>
-        <w:rPr>
-          <w:b/>
-          <w:bCs/>
-        </w:rPr>
-        <w:t>danach</w:t>
-      </w:r>
-      <w:r>
-        <w:t xml:space="preserve"> werden diese beiden ausgewählten Lösungen kombiniert; bei </w:t>
-      </w:r>
-      <w:proofErr w:type="spellStart"/>
-      <w:r>
-        <w:t>dual_w</w:t>
-      </w:r>
-      <w:proofErr w:type="spellEnd"/>
-      <w:r>
-        <w:t xml:space="preserve"> mit Gewichten proportional zu \(</w:t>
-      </w:r>
-      <w:proofErr w:type="spellStart"/>
-      <w:r>
-        <w:t>HETe</w:t>
-      </w:r>
-      <w:proofErr w:type="spellEnd"/>
-      <w:r>
-        <w:t xml:space="preserve">^{-1}\). </w:t>
-      </w:r>
-      <w:proofErr w:type="spellStart"/>
-      <w:r>
-        <w:t>nslphom_dual</w:t>
-      </w:r>
-      <w:proofErr w:type="spellEnd"/>
-      <w:r>
-        <w:t xml:space="preserve">(6) </w:t>
-      </w:r>
-      <w:proofErr w:type="spellStart"/>
-      <w:r>
-        <w:t>nslphom_dual</w:t>
-      </w:r>
-      <w:proofErr w:type="spellEnd"/>
-      <w:r>
-        <w:t>(6)</w:t>
-      </w:r>
-    </w:p>
-    <w:p>
-      <w:r>
-        <w:t xml:space="preserve">Genau das macht auch dein Code: </w:t>
-      </w:r>
-      <w:proofErr w:type="spellStart"/>
-      <w:r>
-        <w:t>nslphom_osqp</w:t>
-      </w:r>
-      <w:proofErr w:type="spellEnd"/>
-      <w:r>
-        <w:t xml:space="preserve">() wählt mit </w:t>
-      </w:r>
-      <w:proofErr w:type="spellStart"/>
-      <w:r>
-        <w:t>which.min</w:t>
-      </w:r>
-      <w:proofErr w:type="spellEnd"/>
-      <w:r>
-        <w:t>(</w:t>
-      </w:r>
-      <w:proofErr w:type="spellStart"/>
-      <w:r>
-        <w:t>HETe.sequence</w:t>
-      </w:r>
-      <w:proofErr w:type="spellEnd"/>
-      <w:r>
-        <w:t xml:space="preserve">) zunächst innerhalb jeder Richtung die beste Iteration aus; </w:t>
-      </w:r>
-      <w:proofErr w:type="spellStart"/>
-      <w:r>
-        <w:t>nslphom_dual_osqp</w:t>
-      </w:r>
-      <w:proofErr w:type="spellEnd"/>
-      <w:r>
-        <w:t xml:space="preserve">() kombiniert anschließend genau diese beiden Matrizen. Das danach berechnete </w:t>
-      </w:r>
-      <w:proofErr w:type="spellStart"/>
-      <w:r>
-        <w:t>HETe.w</w:t>
-      </w:r>
-      <w:proofErr w:type="spellEnd"/>
-      <w:r>
-        <w:t xml:space="preserve"> beschreibt die kombinierte Lösung, wird aber </w:t>
-      </w:r>
-      <w:r>
-        <w:rPr>
-          <w:b/>
-          <w:bCs/>
-        </w:rPr>
-        <w:t>nicht nochmals zur Auswahl der richtungsspezifischen Iterationen verwendet</w:t>
-      </w:r>
-      <w:r>
-        <w:t xml:space="preserve">. </w:t>
-      </w:r>
-      <w:proofErr w:type="spellStart"/>
-      <w:r>
-        <w:t>nslphom_functions</w:t>
-      </w:r>
-      <w:proofErr w:type="spellEnd"/>
-      <w:r>
-        <w:t xml:space="preserve"> </w:t>
-      </w:r>
-      <w:proofErr w:type="spellStart"/>
-      <w:r>
-        <w:t>nslphom_functions</w:t>
-      </w:r>
-      <w:proofErr w:type="spellEnd"/>
-    </w:p>
-    <w:p>
-      <w:r>
-        <w:t xml:space="preserve">Das erklärt deine Grafiken sehr gut: Wenn du </w:t>
-      </w:r>
-      <w:proofErr w:type="spellStart"/>
-      <w:r>
-        <w:t>iter_max</w:t>
-      </w:r>
-      <w:proofErr w:type="spellEnd"/>
-      <w:r>
-        <w:t xml:space="preserve"> erhöhst, darf jede Richtung unter mehr Kandidaten suchen. Sobald beispielsweise bei Iteration 20 ein etwas kleinerer richtungsspezifischer </w:t>
-      </w:r>
-      <w:proofErr w:type="spellStart"/>
-      <w:r>
-        <w:t>HETe</w:t>
-      </w:r>
-      <w:proofErr w:type="spellEnd"/>
-      <w:r>
-        <w:t xml:space="preserve"> gefunden wird, ersetzt </w:t>
-      </w:r>
-      <w:proofErr w:type="spellStart"/>
-      <w:r>
-        <w:t>nslphom</w:t>
-      </w:r>
-      <w:proofErr w:type="spellEnd"/>
-      <w:r>
-        <w:t xml:space="preserve"> die vorher verwendete Matrix. </w:t>
-      </w:r>
-      <w:r>
-        <w:rPr>
-          <w:b/>
-          <w:bCs/>
-        </w:rPr>
-        <w:t xml:space="preserve">Diese neue Einzelmatrix kann nach der dualen Kombination aber einen höheren </w:t>
-      </w:r>
-      <w:proofErr w:type="spellStart"/>
-      <w:r>
-        <w:rPr>
-          <w:b/>
-          <w:bCs/>
-        </w:rPr>
-        <w:t>HETe</w:t>
-      </w:r>
-      <w:proofErr w:type="spellEnd"/>
-      <w:r>
-        <w:rPr>
-          <w:b/>
-          <w:bCs/>
-        </w:rPr>
-        <w:t xml:space="preserve"> der kombinierten Matrix erzeugen.</w:t>
-      </w:r>
-      <w:r>
-        <w:t xml:space="preserve"> Es gibt keine mathematische Garantie, dass</w:t>
-      </w:r>
-    </w:p>
-    <w:p>
-      <w:r>
-        <w:t xml:space="preserve">\[ </w:t>
-      </w:r>
-      <w:proofErr w:type="spellStart"/>
-      <w:r>
-        <w:t>HETe</w:t>
-      </w:r>
-      <w:proofErr w:type="spellEnd"/>
-      <w:r>
-        <w:t>_{12}\</w:t>
-      </w:r>
-      <w:proofErr w:type="spellStart"/>
-      <w:r>
-        <w:t>downarrow</w:t>
-      </w:r>
-      <w:proofErr w:type="spellEnd"/>
-      <w:r>
-        <w:t>,\</w:t>
-      </w:r>
-      <w:proofErr w:type="spellStart"/>
-      <w:r>
-        <w:t>qquad</w:t>
-      </w:r>
-      <w:proofErr w:type="spellEnd"/>
-      <w:r>
-        <w:t xml:space="preserve"> </w:t>
-      </w:r>
-      <w:proofErr w:type="spellStart"/>
-      <w:r>
-        <w:t>HETe</w:t>
-      </w:r>
-      <w:proofErr w:type="spellEnd"/>
-      <w:r>
-        <w:t>_{21}\</w:t>
-      </w:r>
-      <w:proofErr w:type="spellStart"/>
-      <w:r>
-        <w:t>downarrow</w:t>
-      </w:r>
-      <w:proofErr w:type="spellEnd"/>
-      <w:r>
-        <w:t xml:space="preserve"> \]</w:t>
-      </w:r>
-    </w:p>
-    <w:p>
-      <w:r>
-        <w:t>auch zu</w:t>
-      </w:r>
-    </w:p>
-    <w:p>
-      <w:r>
-        <w:lastRenderedPageBreak/>
-        <w:t xml:space="preserve">\[ </w:t>
-      </w:r>
-      <w:proofErr w:type="spellStart"/>
-      <w:r>
-        <w:t>HETe</w:t>
-      </w:r>
-      <w:proofErr w:type="spellEnd"/>
-      <w:r>
-        <w:t>_{\</w:t>
-      </w:r>
-      <w:proofErr w:type="spellStart"/>
-      <w:r>
-        <w:t>mathrm</w:t>
-      </w:r>
-      <w:proofErr w:type="spellEnd"/>
-      <w:r>
-        <w:t>{dual},w}\</w:t>
-      </w:r>
-      <w:proofErr w:type="spellStart"/>
-      <w:r>
-        <w:t>downarrow</w:t>
-      </w:r>
-      <w:proofErr w:type="spellEnd"/>
-      <w:r>
-        <w:t xml:space="preserve"> \]</w:t>
-      </w:r>
-    </w:p>
-    <w:p>
-      <w:r>
-        <w:t>führt.</w:t>
-      </w:r>
-    </w:p>
-    <w:p>
-      <w:r>
-        <w:t xml:space="preserve">Und hier kommt dein Gedanke mit einem kleinen </w:t>
-      </w:r>
-      <w:proofErr w:type="spellStart"/>
-      <w:r>
-        <w:t>iter_max</w:t>
-      </w:r>
-      <w:proofErr w:type="spellEnd"/>
-      <w:r>
-        <w:t xml:space="preserve"> ins Spiel. Das ist tatsächlich sehr nah an der Motivation von Pavía und Romero. Sie beschreiben zwei zulässige Varianten von </w:t>
-      </w:r>
-      <w:proofErr w:type="spellStart"/>
-      <w:r>
-        <w:t>nslphom</w:t>
-      </w:r>
-      <w:proofErr w:type="spellEnd"/>
-      <w:r>
-        <w:t xml:space="preserve">: entweder beim </w:t>
-      </w:r>
-      <w:r>
-        <w:rPr>
-          <w:b/>
-          <w:bCs/>
-        </w:rPr>
-        <w:t xml:space="preserve">ersten lokalen </w:t>
-      </w:r>
-      <w:proofErr w:type="spellStart"/>
-      <w:r>
-        <w:rPr>
-          <w:b/>
-          <w:bCs/>
-        </w:rPr>
-        <w:t>HETe</w:t>
-      </w:r>
-      <w:proofErr w:type="spellEnd"/>
-      <w:r>
-        <w:rPr>
-          <w:b/>
-          <w:bCs/>
-        </w:rPr>
-        <w:t>-Minimum</w:t>
-      </w:r>
-      <w:r>
-        <w:t xml:space="preserve"> stoppen (</w:t>
-      </w:r>
-      <w:proofErr w:type="spellStart"/>
-      <w:r>
-        <w:t>min.first</w:t>
-      </w:r>
-      <w:proofErr w:type="spellEnd"/>
-      <w:r>
-        <w:t xml:space="preserve"> = TRUE) oder eine </w:t>
-      </w:r>
-      <w:r>
-        <w:rPr>
-          <w:b/>
-          <w:bCs/>
-        </w:rPr>
-        <w:t>vorab begrenzte Zahl \(</w:t>
-      </w:r>
-      <w:proofErr w:type="spellStart"/>
-      <w:r>
-        <w:rPr>
-          <w:b/>
-          <w:bCs/>
-        </w:rPr>
-        <w:t>ns</w:t>
-      </w:r>
-      <w:proofErr w:type="spellEnd"/>
-      <w:r>
-        <w:rPr>
-          <w:b/>
-          <w:bCs/>
-        </w:rPr>
-        <w:t>\)</w:t>
-      </w:r>
-      <w:r>
-        <w:t xml:space="preserve"> von Iterationen zulassen und daraus die kleinste </w:t>
-      </w:r>
-      <w:proofErr w:type="spellStart"/>
-      <w:r>
-        <w:t>HETe</w:t>
-      </w:r>
-      <w:proofErr w:type="spellEnd"/>
-      <w:r>
-        <w:t>-Lösung wählen. Besonders relevant für dich ist ihre ausdrückliche Warnung: Mit wachsendem \(</w:t>
-      </w:r>
-      <w:proofErr w:type="spellStart"/>
-      <w:r>
-        <w:t>ns</w:t>
-      </w:r>
-      <w:proofErr w:type="spellEnd"/>
-      <w:r>
-        <w:t xml:space="preserve">\) steigt zwar die Chance, einen noch kleineren </w:t>
-      </w:r>
-      <w:proofErr w:type="spellStart"/>
-      <w:r>
-        <w:t>HETe</w:t>
-      </w:r>
-      <w:proofErr w:type="spellEnd"/>
-      <w:r>
-        <w:t xml:space="preserve"> zu finden, die tatsächliche Punktlösung kann sich dabei aber trotzdem verschlechtern — sogar dann, wenn </w:t>
-      </w:r>
-      <w:proofErr w:type="spellStart"/>
-      <w:r>
-        <w:t>HETe</w:t>
-      </w:r>
-      <w:proofErr w:type="spellEnd"/>
-      <w:r>
-        <w:t xml:space="preserve"> weiter sinkt. Deshalb empfehlen sie für die zweite Variante bewusst eine relativ kleine Iterationszahl. </w:t>
-      </w:r>
-      <w:proofErr w:type="spellStart"/>
-      <w:r>
-        <w:t>lphom</w:t>
-      </w:r>
-      <w:proofErr w:type="spellEnd"/>
-    </w:p>
-    <w:p>
-      <w:r>
-        <w:t xml:space="preserve">Das ist also </w:t>
-      </w:r>
-      <w:proofErr w:type="spellStart"/>
-      <w:r>
-        <w:rPr>
-          <w:b/>
-          <w:bCs/>
-        </w:rPr>
-        <w:t>overfitting</w:t>
-      </w:r>
-      <w:proofErr w:type="spellEnd"/>
-      <w:r>
-        <w:rPr>
-          <w:b/>
-          <w:bCs/>
-        </w:rPr>
-        <w:t>-artig</w:t>
-      </w:r>
-      <w:r>
-        <w:t>, aber ich würde in der Arbeit nicht unbedingt das Wort „</w:t>
-      </w:r>
-      <w:proofErr w:type="spellStart"/>
-      <w:r>
-        <w:t>Overfitting</w:t>
-      </w:r>
-      <w:proofErr w:type="spellEnd"/>
-      <w:r>
-        <w:t xml:space="preserve">“ verwenden. Es ist kein klassisches </w:t>
-      </w:r>
-      <w:proofErr w:type="spellStart"/>
-      <w:r>
-        <w:t>Overfitting</w:t>
-      </w:r>
-      <w:proofErr w:type="spellEnd"/>
-      <w:r>
-        <w:t xml:space="preserve"> eines Regressionsmodells. Präziser wäre:</w:t>
-      </w:r>
-    </w:p>
-    <w:p>
-      <w:r>
-        <w:t xml:space="preserve">Eine sehr große Zahl zugelassener Iterationen erhöht die Möglichkeit, die Schätzung zunehmend an das modellinterne </w:t>
-      </w:r>
-      <w:proofErr w:type="spellStart"/>
-      <w:r>
-        <w:t>HETe</w:t>
-      </w:r>
-      <w:proofErr w:type="spellEnd"/>
-      <w:r>
-        <w:t xml:space="preserve">-Kriterium anzupassen, obwohl ein kleinerer </w:t>
-      </w:r>
-      <w:proofErr w:type="spellStart"/>
-      <w:r>
-        <w:t>HETe</w:t>
-      </w:r>
-      <w:proofErr w:type="spellEnd"/>
-      <w:r>
-        <w:t xml:space="preserve"> nicht zwingend mit einer genaueren unbekannten Übergangsmatrix einhergeht.</w:t>
-      </w:r>
-    </w:p>
-    <w:p>
-      <w:r>
-        <w:t xml:space="preserve">Genau dafür liefern Pavía und Romero sogar empirische Evidenz: ns_10 hatte in ihren Daten den besten Kompromiss aus Genauigkeit und Rechenaufwand; ns_25 und </w:t>
-      </w:r>
-      <w:proofErr w:type="spellStart"/>
-      <w:r>
-        <w:t>ns_first</w:t>
-      </w:r>
-      <w:proofErr w:type="spellEnd"/>
-      <w:r>
-        <w:t xml:space="preserve"> waren ebenfalls konkurrenzfähig, während ns_50 und ns_100 keine systematische Verbesserung brachten und teilweise sogar schlechtere wahre Punktlösungen ergaben. </w:t>
-      </w:r>
-      <w:proofErr w:type="spellStart"/>
-      <w:r>
-        <w:t>lphom</w:t>
-      </w:r>
-      <w:proofErr w:type="spellEnd"/>
-    </w:p>
-    <w:p>
-      <w:r>
-        <w:t xml:space="preserve">Damit ist deine Idee </w:t>
-      </w:r>
-      <w:r>
-        <w:rPr>
-          <w:b/>
-          <w:bCs/>
-        </w:rPr>
-        <w:t>inhaltlich plausibel</w:t>
-      </w:r>
-      <w:r>
-        <w:t>:</w:t>
-      </w:r>
-    </w:p>
-    <w:p>
-      <w:proofErr w:type="spellStart"/>
-      <w:r>
-        <w:t>iter_max</w:t>
-      </w:r>
-      <w:proofErr w:type="spellEnd"/>
-      <w:r>
-        <w:t xml:space="preserve"> klein halten, damit spätere, nur nach dem richtungsspezifischen </w:t>
-      </w:r>
-      <w:proofErr w:type="spellStart"/>
-      <w:r>
-        <w:t>HETe</w:t>
-      </w:r>
-      <w:proofErr w:type="spellEnd"/>
-      <w:r>
-        <w:t xml:space="preserve"> attraktivere Lösungen die endgültige duale Kombination nicht verschlechtern.</w:t>
-      </w:r>
-    </w:p>
-    <w:p>
-      <w:r>
-        <w:t xml:space="preserve">Aber es gibt einen wichtigen methodischen Unterschied: </w:t>
-      </w:r>
-      <w:r>
-        <w:rPr>
-          <w:b/>
-          <w:bCs/>
-        </w:rPr>
-        <w:t>Pavía und Romero wählen das kleine \(</w:t>
-      </w:r>
-      <w:proofErr w:type="spellStart"/>
-      <w:r>
-        <w:rPr>
-          <w:b/>
-          <w:bCs/>
-        </w:rPr>
-        <w:t>ns</w:t>
-      </w:r>
-      <w:proofErr w:type="spellEnd"/>
-      <w:r>
-        <w:rPr>
-          <w:b/>
-          <w:bCs/>
-        </w:rPr>
-        <w:t xml:space="preserve">\) nicht dadurch, dass sie für genau einen Datensatz nachträglich den </w:t>
-      </w:r>
-      <w:proofErr w:type="spellStart"/>
-      <w:r>
-        <w:rPr>
-          <w:b/>
-          <w:bCs/>
-        </w:rPr>
-        <w:t>HETe</w:t>
-      </w:r>
-      <w:proofErr w:type="spellEnd"/>
-      <w:r>
-        <w:rPr>
-          <w:b/>
-          <w:bCs/>
-        </w:rPr>
-        <w:t xml:space="preserve"> der fertigen Dualmatrix über \(</w:t>
-      </w:r>
-      <w:proofErr w:type="spellStart"/>
-      <w:r>
-        <w:rPr>
-          <w:b/>
-          <w:bCs/>
-        </w:rPr>
-        <w:t>ns</w:t>
-      </w:r>
-      <w:proofErr w:type="spellEnd"/>
-      <w:r>
-        <w:rPr>
-          <w:b/>
-          <w:bCs/>
-        </w:rPr>
-        <w:t>=1,\dots,80\) minimieren.</w:t>
-      </w:r>
-      <w:r>
-        <w:t xml:space="preserve"> Sie untersuchen mit bekannten wahren Übergangsmatrizen, welche festen Iterationsregeln im Mittel gut funktionieren. Dein Verfahren</w:t>
-      </w:r>
-    </w:p>
-    <w:p>
-      <w:r>
-        <w:t>\[ \</w:t>
-      </w:r>
-      <w:proofErr w:type="spellStart"/>
-      <w:r>
-        <w:t>widehat</w:t>
-      </w:r>
-      <w:proofErr w:type="spellEnd"/>
-      <w:r>
-        <w:t>{m} = \arg\</w:t>
-      </w:r>
-      <w:proofErr w:type="spellStart"/>
-      <w:r>
-        <w:t>min_m</w:t>
-      </w:r>
-      <w:proofErr w:type="spellEnd"/>
-      <w:r>
-        <w:t xml:space="preserve"> </w:t>
-      </w:r>
-      <w:proofErr w:type="spellStart"/>
-      <w:r>
-        <w:t>HETe</w:t>
-      </w:r>
-      <w:proofErr w:type="spellEnd"/>
-      <w:r>
-        <w:t>_{\</w:t>
-      </w:r>
-      <w:proofErr w:type="spellStart"/>
-      <w:r>
-        <w:t>mathrm</w:t>
-      </w:r>
-      <w:proofErr w:type="spellEnd"/>
-      <w:r>
-        <w:t>{dual},w}(m) \]</w:t>
-      </w:r>
-    </w:p>
-    <w:p>
-      <w:r>
-        <w:t xml:space="preserve">ist daher eine </w:t>
-      </w:r>
-      <w:r>
-        <w:rPr>
-          <w:b/>
-          <w:bCs/>
-        </w:rPr>
-        <w:t>eigene zusätzliche Auswahlregel</w:t>
-      </w:r>
-      <w:r>
-        <w:t xml:space="preserve">. Sie ist logisch konsistent, weil du das Kriterium direkt auf die finale, tatsächlich verwendete Dualmatrix anwendest; sie gehört aber nicht zum Standardalgorithmus von </w:t>
-      </w:r>
-      <w:proofErr w:type="spellStart"/>
-      <w:r>
-        <w:t>nslphom_dual</w:t>
-      </w:r>
-      <w:proofErr w:type="spellEnd"/>
-      <w:r>
-        <w:t>.</w:t>
-      </w:r>
-    </w:p>
-    <w:p>
-      <w:r>
-        <w:t>Ich würde deshalb drei Dinge auseinanderhalten:</w:t>
-      </w:r>
-    </w:p>
-    <w:p>
-      <w:pPr>
-        <w:numPr>
-          <w:ilvl w:val="0"/>
-          <w:numId w:val="24"/>
-        </w:numPr>
-      </w:pPr>
-      <w:r>
-        <w:rPr>
-          <w:b/>
-          <w:bCs/>
-        </w:rPr>
-        <w:t>Standard-</w:t>
-      </w:r>
-      <w:proofErr w:type="spellStart"/>
-      <w:r>
-        <w:rPr>
-          <w:b/>
-          <w:bCs/>
-        </w:rPr>
-        <w:t>nslphom</w:t>
-      </w:r>
-      <w:proofErr w:type="spellEnd"/>
-      <w:r>
-        <w:rPr>
-          <w:b/>
-          <w:bCs/>
-        </w:rPr>
-        <w:t>:</w:t>
-      </w:r>
-      <w:r>
-        <w:t xml:space="preserve"> innerhalb eines vorgegebenen </w:t>
-      </w:r>
-      <w:proofErr w:type="spellStart"/>
-      <w:r>
-        <w:t>iter_max</w:t>
-      </w:r>
-      <w:proofErr w:type="spellEnd"/>
-      <w:r>
-        <w:t xml:space="preserve"> die Iteration mit kleinstem </w:t>
-      </w:r>
-      <w:proofErr w:type="spellStart"/>
-      <w:r>
-        <w:t>HETe</w:t>
-      </w:r>
-      <w:proofErr w:type="spellEnd"/>
-      <w:r>
-        <w:t xml:space="preserve"> wählen.</w:t>
-      </w:r>
-    </w:p>
-    <w:p>
-      <w:pPr>
-        <w:numPr>
-          <w:ilvl w:val="0"/>
-          <w:numId w:val="24"/>
-        </w:numPr>
-      </w:pPr>
-      <w:r>
-        <w:rPr>
-          <w:b/>
-          <w:bCs/>
-        </w:rPr>
-        <w:t>Standard-</w:t>
-      </w:r>
-      <w:proofErr w:type="spellStart"/>
-      <w:r>
-        <w:rPr>
-          <w:b/>
-          <w:bCs/>
-        </w:rPr>
-        <w:t>nslphom_dual_w</w:t>
-      </w:r>
-      <w:proofErr w:type="spellEnd"/>
-      <w:r>
-        <w:rPr>
-          <w:b/>
-          <w:bCs/>
-        </w:rPr>
-        <w:t>:</w:t>
-      </w:r>
-      <w:r>
-        <w:t xml:space="preserve"> das separat für beide Richtungen tun und anschließend die beiden Lösungen invers nach ihren jeweiligen </w:t>
-      </w:r>
-      <w:proofErr w:type="spellStart"/>
-      <w:r>
-        <w:t>HETe</w:t>
-      </w:r>
-      <w:proofErr w:type="spellEnd"/>
-      <w:r>
-        <w:t>-Werten kombinieren.</w:t>
-      </w:r>
-    </w:p>
-    <w:p>
-      <w:pPr>
-        <w:numPr>
-          <w:ilvl w:val="0"/>
-          <w:numId w:val="24"/>
-        </w:numPr>
-      </w:pPr>
-      <w:r>
-        <w:rPr>
-          <w:b/>
-          <w:bCs/>
-        </w:rPr>
-        <w:t>Deine Erweiterung:</w:t>
-      </w:r>
-      <w:r>
-        <w:t xml:space="preserve"> verschiedene </w:t>
-      </w:r>
-      <w:proofErr w:type="spellStart"/>
-      <w:r>
-        <w:t>iter_max</w:t>
-      </w:r>
-      <w:proofErr w:type="spellEnd"/>
-      <w:r>
-        <w:t xml:space="preserve"> vergleichen und den Wert wählen, bei dem der anschließend neu berechnete </w:t>
-      </w:r>
-      <w:proofErr w:type="spellStart"/>
-      <w:r>
-        <w:t>HETe</w:t>
-      </w:r>
-      <w:proofErr w:type="spellEnd"/>
-      <w:r>
-        <w:t xml:space="preserve"> der gewichteten Dualmatrix minimal ist.</w:t>
-      </w:r>
-    </w:p>
-    <w:p>
-      <w:r>
-        <w:t xml:space="preserve">Diese dritte Stufe ist nicht absurd — im Gegenteil, sie passt zu deiner eigentlichen Zielgröße besser als nur die beiden Richtungskriterien isoliert zu betrachten. Aber du solltest sie </w:t>
-      </w:r>
-      <w:r>
-        <w:rPr>
-          <w:b/>
-          <w:bCs/>
-        </w:rPr>
-        <w:t xml:space="preserve">nicht als originäre </w:t>
-      </w:r>
-      <w:proofErr w:type="spellStart"/>
-      <w:r>
-        <w:rPr>
-          <w:b/>
-          <w:bCs/>
-        </w:rPr>
-        <w:t>nslphom_dual</w:t>
-      </w:r>
-      <w:proofErr w:type="spellEnd"/>
-      <w:r>
-        <w:rPr>
-          <w:b/>
-          <w:bCs/>
-        </w:rPr>
-        <w:t>-Logik darstellen</w:t>
-      </w:r>
-      <w:r>
-        <w:t>, sondern als eigene Iterationsdiagnostik.</w:t>
-      </w:r>
-    </w:p>
-    <w:p>
-      <w:r>
-        <w:lastRenderedPageBreak/>
-        <w:t>Mein methodischer Rat wäre daher jetzt:</w:t>
-      </w:r>
-    </w:p>
-    <w:p>
-      <w:r>
-        <w:t xml:space="preserve">Wenn du bei </w:t>
-      </w:r>
-      <w:proofErr w:type="spellStart"/>
-      <w:r>
-        <w:t>iter_max</w:t>
-      </w:r>
-      <w:proofErr w:type="spellEnd"/>
-      <w:r>
-        <w:t xml:space="preserve">=2 bleiben willst, ist das vertretbar, </w:t>
-      </w:r>
-      <w:r>
-        <w:rPr>
-          <w:b/>
-          <w:bCs/>
-        </w:rPr>
-        <w:t>wenn du es als bewusstes Early-</w:t>
-      </w:r>
-      <w:proofErr w:type="spellStart"/>
-      <w:r>
-        <w:rPr>
-          <w:b/>
-          <w:bCs/>
-        </w:rPr>
-        <w:t>Stopping</w:t>
-      </w:r>
-      <w:proofErr w:type="spellEnd"/>
-      <w:r>
-        <w:rPr>
-          <w:b/>
-          <w:bCs/>
-        </w:rPr>
-        <w:t>-/</w:t>
-      </w:r>
-      <w:proofErr w:type="spellStart"/>
-      <w:r>
-        <w:rPr>
-          <w:b/>
-          <w:bCs/>
-        </w:rPr>
-        <w:t>Regularisierungskriterium</w:t>
-      </w:r>
-      <w:proofErr w:type="spellEnd"/>
-      <w:r>
-        <w:rPr>
-          <w:b/>
-          <w:bCs/>
-        </w:rPr>
-        <w:t xml:space="preserve"> der dualen Gesamtlösung formulierst und nicht als „global optimale </w:t>
-      </w:r>
-      <w:proofErr w:type="spellStart"/>
-      <w:r>
-        <w:rPr>
-          <w:b/>
-          <w:bCs/>
-        </w:rPr>
-        <w:t>nslphom</w:t>
-      </w:r>
-      <w:proofErr w:type="spellEnd"/>
-      <w:r>
-        <w:rPr>
-          <w:b/>
-          <w:bCs/>
-        </w:rPr>
-        <w:t>-Lösung“</w:t>
-      </w:r>
-      <w:r>
-        <w:t xml:space="preserve">. Noch stärker würde die Begründung, wenn deine Simulation zeigt, dass sehr frühe Iterationen zumindest nicht schlechter abschneiden als große </w:t>
-      </w:r>
-      <w:proofErr w:type="spellStart"/>
-      <w:r>
-        <w:t>iter_max</w:t>
-      </w:r>
-      <w:proofErr w:type="spellEnd"/>
-      <w:r>
-        <w:t>-Werte.</w:t>
-      </w:r>
-    </w:p>
-    <w:p>
-      <w:r>
-        <w:t>Für deine Arbeit könnte die Kernaussage etwa lauten:</w:t>
-      </w:r>
-    </w:p>
-    <w:p>
-      <w:r>
-        <w:t xml:space="preserve">Da ein kleinerer richtungsspezifischer </w:t>
-      </w:r>
-      <w:proofErr w:type="spellStart"/>
-      <w:r>
-        <w:t>HETe</w:t>
-      </w:r>
-      <w:proofErr w:type="spellEnd"/>
-      <w:r>
-        <w:t xml:space="preserve"> nicht zwingend zu einer</w:t>
-      </w:r>
-    </w:p>
-    <w:p>
-      <w:r>
-        <w:t>besseren kombinierten dualen Lösung führt, wurde die maximale Iterationszahl</w:t>
-      </w:r>
-    </w:p>
-    <w:p>
-      <w:r>
-        <w:t>nicht allein anhand der beiden Einzelrichtungen festgelegt. Für</w:t>
-      </w:r>
-    </w:p>
-    <w:p>
-      <w:r>
-        <w:t>$m=1,\ldots,80$ wurde rekonstruiert, welche richtungsspezifischen</w:t>
-      </w:r>
-    </w:p>
-    <w:p>
-      <w:r>
-        <w:t>\</w:t>
-      </w:r>
-      <w:proofErr w:type="spellStart"/>
-      <w:r>
-        <w:t>textit</w:t>
-      </w:r>
-      <w:proofErr w:type="spellEnd"/>
-      <w:r>
-        <w:t>{</w:t>
-      </w:r>
-      <w:proofErr w:type="spellStart"/>
-      <w:r>
-        <w:t>nslphom</w:t>
-      </w:r>
-      <w:proofErr w:type="spellEnd"/>
-      <w:r>
-        <w:t>}-Lösungen bei \</w:t>
-      </w:r>
-      <w:proofErr w:type="spellStart"/>
-      <w:r>
-        <w:t>texttt</w:t>
-      </w:r>
-      <w:proofErr w:type="spellEnd"/>
-      <w:r>
-        <w:t>{</w:t>
-      </w:r>
-      <w:proofErr w:type="spellStart"/>
-      <w:r>
-        <w:t>iter</w:t>
-      </w:r>
-      <w:proofErr w:type="spellEnd"/>
-      <w:r>
-        <w:t>\_</w:t>
-      </w:r>
-      <w:proofErr w:type="spellStart"/>
-      <w:r>
-        <w:t>max</w:t>
-      </w:r>
-      <w:proofErr w:type="spellEnd"/>
-      <w:r>
-        <w:t>}=$m$ ausgewählt würden,</w:t>
-      </w:r>
-    </w:p>
-    <w:p>
-      <w:r>
-        <w:t>diese anschließend gemäß der gewichteten dualen Schätzung kombiniert und</w:t>
-      </w:r>
-    </w:p>
-    <w:p>
-      <w:r>
-        <w:t xml:space="preserve">der </w:t>
-      </w:r>
-      <w:proofErr w:type="spellStart"/>
-      <w:r>
-        <w:t>HETe</w:t>
-      </w:r>
-      <w:proofErr w:type="spellEnd"/>
-      <w:r>
-        <w:t xml:space="preserve"> der resultierenden Matrix erneut berechnet. Das Minimum dieses</w:t>
-      </w:r>
-    </w:p>
-    <w:p>
-      <w:r>
-        <w:t>Kriteriums liegt bei \</w:t>
-      </w:r>
-      <w:proofErr w:type="spellStart"/>
-      <w:r>
-        <w:t>texttt</w:t>
-      </w:r>
-      <w:proofErr w:type="spellEnd"/>
-      <w:r>
-        <w:t>{</w:t>
-      </w:r>
-      <w:proofErr w:type="spellStart"/>
-      <w:r>
-        <w:t>iter</w:t>
-      </w:r>
-      <w:proofErr w:type="spellEnd"/>
-      <w:r>
-        <w:t>\_</w:t>
-      </w:r>
-      <w:proofErr w:type="spellStart"/>
-      <w:r>
-        <w:t>max</w:t>
-      </w:r>
-      <w:proofErr w:type="spellEnd"/>
-      <w:r>
-        <w:t>}=2.</w:t>
-      </w:r>
-    </w:p>
-    <w:p/>
-    <w:p>
-      <w:r>
-        <w:t>Die Begrenzung auf eine kleine Iterationszahl ist auch vor dem Hintergrund</w:t>
-      </w:r>
-    </w:p>
-    <w:p>
-      <w:r>
-        <w:t>von \</w:t>
-      </w:r>
-      <w:proofErr w:type="spellStart"/>
-      <w:r>
-        <w:t>textcite</w:t>
-      </w:r>
-      <w:proofErr w:type="spellEnd"/>
-      <w:r>
-        <w:t>{PaviaRomero2024a} plausibel. Die Autoren zeigen, dass mit</w:t>
-      </w:r>
-    </w:p>
-    <w:p>
-      <w:r>
-        <w:t xml:space="preserve">zunehmender Zahl zugelassener Iterationen zwar kleinere </w:t>
-      </w:r>
-      <w:proofErr w:type="spellStart"/>
-      <w:r>
-        <w:t>HETe</w:t>
-      </w:r>
-      <w:proofErr w:type="spellEnd"/>
-      <w:r>
-        <w:t>-Werte gefunden</w:t>
-      </w:r>
-    </w:p>
-    <w:p>
-      <w:r>
-        <w:t>werden können, sich die tatsächlichen Punktlösungen jedoch nicht zwingend</w:t>
-      </w:r>
-    </w:p>
-    <w:p>
-      <w:r>
-        <w:t>verbessern und teilweise sogar verschlechtern. Eine kleine Iterationszahl</w:t>
-      </w:r>
-    </w:p>
-    <w:p>
-      <w:r>
-        <w:t>kann daher als Form eines frühen Abbruchs verstanden werden, die eine</w:t>
-      </w:r>
-    </w:p>
-    <w:p>
-      <w:r>
-        <w:t xml:space="preserve">übermäßige Anpassung an das modellinterne </w:t>
-      </w:r>
-      <w:proofErr w:type="spellStart"/>
-      <w:r>
-        <w:t>HETe</w:t>
-      </w:r>
-      <w:proofErr w:type="spellEnd"/>
-      <w:r>
-        <w:t>-Kriterium begrenzt.</w:t>
-      </w:r>
-    </w:p>
-    <w:p>
-      <w:r>
-        <w:t xml:space="preserve">Ich würde dabei </w:t>
-      </w:r>
-      <w:r>
-        <w:rPr>
-          <w:b/>
-          <w:bCs/>
-        </w:rPr>
-        <w:t>nicht „</w:t>
-      </w:r>
-      <w:proofErr w:type="spellStart"/>
-      <w:r>
-        <w:rPr>
-          <w:b/>
-          <w:bCs/>
-        </w:rPr>
-        <w:t>Overfitting</w:t>
-      </w:r>
-      <w:proofErr w:type="spellEnd"/>
-      <w:r>
-        <w:rPr>
-          <w:b/>
-          <w:bCs/>
-        </w:rPr>
-        <w:t>“ als festen Fachbegriff</w:t>
-      </w:r>
-      <w:r>
-        <w:t xml:space="preserve"> verwenden, sondern eher „übermäßige Anpassung an das interne </w:t>
-      </w:r>
-      <w:proofErr w:type="spellStart"/>
-      <w:r>
-        <w:t>HETe</w:t>
-      </w:r>
-      <w:proofErr w:type="spellEnd"/>
-      <w:r>
-        <w:t xml:space="preserve">-Kriterium“ oder „Early </w:t>
-      </w:r>
-      <w:proofErr w:type="spellStart"/>
-      <w:r>
-        <w:t>Stopping</w:t>
-      </w:r>
-      <w:proofErr w:type="spellEnd"/>
-      <w:r>
-        <w:t>“. Das trifft dein Argument präziser.</w:t>
-      </w:r>
-    </w:p>
-    <w:p/>
     <w:sectPr>
       <w:pgSz w:w="11906" w:h="16838"/>
       <w:pgMar w:top="1417" w:right="1417" w:bottom="1134" w:left="1417" w:header="708" w:footer="708" w:gutter="0"/>
@@ -4106,6 +1390,155 @@
     </w:lvl>
   </w:abstractNum>
   <w:abstractNum w:abstractNumId="8" w15:restartNumberingAfterBreak="0">
+    <w:nsid w:val="31DF74FD"/>
+    <w:multiLevelType w:val="multilevel"/>
+    <w:tmpl w:val="A300A824"/>
+    <w:lvl w:ilvl="0">
+      <w:start w:val="1"/>
+      <w:numFmt w:val="bullet"/>
+      <w:lvlText w:val=""/>
+      <w:lvlJc w:val="left"/>
+      <w:pPr>
+        <w:tabs>
+          <w:tab w:val="num" w:pos="720"/>
+        </w:tabs>
+        <w:ind w:left="720" w:hanging="360"/>
+      </w:pPr>
+      <w:rPr>
+        <w:rFonts w:ascii="Symbol" w:hAnsi="Symbol" w:hint="default"/>
+        <w:sz w:val="20"/>
+      </w:rPr>
+    </w:lvl>
+    <w:lvl w:ilvl="1" w:tentative="1">
+      <w:start w:val="1"/>
+      <w:numFmt w:val="bullet"/>
+      <w:lvlText w:val="o"/>
+      <w:lvlJc w:val="left"/>
+      <w:pPr>
+        <w:tabs>
+          <w:tab w:val="num" w:pos="1440"/>
+        </w:tabs>
+        <w:ind w:left="1440" w:hanging="360"/>
+      </w:pPr>
+      <w:rPr>
+        <w:rFonts w:ascii="Courier New" w:hAnsi="Courier New" w:hint="default"/>
+        <w:sz w:val="20"/>
+      </w:rPr>
+    </w:lvl>
+    <w:lvl w:ilvl="2" w:tentative="1">
+      <w:start w:val="1"/>
+      <w:numFmt w:val="bullet"/>
+      <w:lvlText w:val=""/>
+      <w:lvlJc w:val="left"/>
+      <w:pPr>
+        <w:tabs>
+          <w:tab w:val="num" w:pos="2160"/>
+        </w:tabs>
+        <w:ind w:left="2160" w:hanging="360"/>
+      </w:pPr>
+      <w:rPr>
+        <w:rFonts w:ascii="Wingdings" w:hAnsi="Wingdings" w:hint="default"/>
+        <w:sz w:val="20"/>
+      </w:rPr>
+    </w:lvl>
+    <w:lvl w:ilvl="3" w:tentative="1">
+      <w:start w:val="1"/>
+      <w:numFmt w:val="bullet"/>
+      <w:lvlText w:val=""/>
+      <w:lvlJc w:val="left"/>
+      <w:pPr>
+        <w:tabs>
+          <w:tab w:val="num" w:pos="2880"/>
+        </w:tabs>
+        <w:ind w:left="2880" w:hanging="360"/>
+      </w:pPr>
+      <w:rPr>
+        <w:rFonts w:ascii="Wingdings" w:hAnsi="Wingdings" w:hint="default"/>
+        <w:sz w:val="20"/>
+      </w:rPr>
+    </w:lvl>
+    <w:lvl w:ilvl="4" w:tentative="1">
+      <w:start w:val="1"/>
+      <w:numFmt w:val="bullet"/>
+      <w:lvlText w:val=""/>
+      <w:lvlJc w:val="left"/>
+      <w:pPr>
+        <w:tabs>
+          <w:tab w:val="num" w:pos="3600"/>
+        </w:tabs>
+        <w:ind w:left="3600" w:hanging="360"/>
+      </w:pPr>
+      <w:rPr>
+        <w:rFonts w:ascii="Wingdings" w:hAnsi="Wingdings" w:hint="default"/>
+        <w:sz w:val="20"/>
+      </w:rPr>
+    </w:lvl>
+    <w:lvl w:ilvl="5" w:tentative="1">
+      <w:start w:val="1"/>
+      <w:numFmt w:val="bullet"/>
+      <w:lvlText w:val=""/>
+      <w:lvlJc w:val="left"/>
+      <w:pPr>
+        <w:tabs>
+          <w:tab w:val="num" w:pos="4320"/>
+        </w:tabs>
+        <w:ind w:left="4320" w:hanging="360"/>
+      </w:pPr>
+      <w:rPr>
+        <w:rFonts w:ascii="Wingdings" w:hAnsi="Wingdings" w:hint="default"/>
+        <w:sz w:val="20"/>
+      </w:rPr>
+    </w:lvl>
+    <w:lvl w:ilvl="6" w:tentative="1">
+      <w:start w:val="1"/>
+      <w:numFmt w:val="bullet"/>
+      <w:lvlText w:val=""/>
+      <w:lvlJc w:val="left"/>
+      <w:pPr>
+        <w:tabs>
+          <w:tab w:val="num" w:pos="5040"/>
+        </w:tabs>
+        <w:ind w:left="5040" w:hanging="360"/>
+      </w:pPr>
+      <w:rPr>
+        <w:rFonts w:ascii="Wingdings" w:hAnsi="Wingdings" w:hint="default"/>
+        <w:sz w:val="20"/>
+      </w:rPr>
+    </w:lvl>
+    <w:lvl w:ilvl="7" w:tentative="1">
+      <w:start w:val="1"/>
+      <w:numFmt w:val="bullet"/>
+      <w:lvlText w:val=""/>
+      <w:lvlJc w:val="left"/>
+      <w:pPr>
+        <w:tabs>
+          <w:tab w:val="num" w:pos="5760"/>
+        </w:tabs>
+        <w:ind w:left="5760" w:hanging="360"/>
+      </w:pPr>
+      <w:rPr>
+        <w:rFonts w:ascii="Wingdings" w:hAnsi="Wingdings" w:hint="default"/>
+        <w:sz w:val="20"/>
+      </w:rPr>
+    </w:lvl>
+    <w:lvl w:ilvl="8" w:tentative="1">
+      <w:start w:val="1"/>
+      <w:numFmt w:val="bullet"/>
+      <w:lvlText w:val=""/>
+      <w:lvlJc w:val="left"/>
+      <w:pPr>
+        <w:tabs>
+          <w:tab w:val="num" w:pos="6480"/>
+        </w:tabs>
+        <w:ind w:left="6480" w:hanging="360"/>
+      </w:pPr>
+      <w:rPr>
+        <w:rFonts w:ascii="Wingdings" w:hAnsi="Wingdings" w:hint="default"/>
+        <w:sz w:val="20"/>
+      </w:rPr>
+    </w:lvl>
+  </w:abstractNum>
+  <w:abstractNum w:abstractNumId="9" w15:restartNumberingAfterBreak="0">
     <w:nsid w:val="341B4049"/>
     <w:multiLevelType w:val="multilevel"/>
     <w:tmpl w:val="07C69E36"/>
@@ -4254,7 +1687,7 @@
       </w:rPr>
     </w:lvl>
   </w:abstractNum>
-  <w:abstractNum w:abstractNumId="9" w15:restartNumberingAfterBreak="0">
+  <w:abstractNum w:abstractNumId="10" w15:restartNumberingAfterBreak="0">
     <w:nsid w:val="3BA26909"/>
     <w:multiLevelType w:val="hybridMultilevel"/>
     <w:tmpl w:val="B320573C"/>
@@ -4367,7 +1800,7 @@
       </w:rPr>
     </w:lvl>
   </w:abstractNum>
-  <w:abstractNum w:abstractNumId="10" w15:restartNumberingAfterBreak="0">
+  <w:abstractNum w:abstractNumId="11" w15:restartNumberingAfterBreak="0">
     <w:nsid w:val="43B12E04"/>
     <w:multiLevelType w:val="multilevel"/>
     <w:tmpl w:val="FB1CF99E"/>
@@ -4480,7 +1913,120 @@
       </w:pPr>
     </w:lvl>
   </w:abstractNum>
-  <w:abstractNum w:abstractNumId="11" w15:restartNumberingAfterBreak="0">
+  <w:abstractNum w:abstractNumId="12" w15:restartNumberingAfterBreak="0">
+    <w:nsid w:val="49184EE7"/>
+    <w:multiLevelType w:val="hybridMultilevel"/>
+    <w:tmpl w:val="639E1852"/>
+    <w:lvl w:ilvl="0" w:tplc="04070001">
+      <w:start w:val="1"/>
+      <w:numFmt w:val="bullet"/>
+      <w:lvlText w:val=""/>
+      <w:lvlJc w:val="left"/>
+      <w:pPr>
+        <w:ind w:left="720" w:hanging="360"/>
+      </w:pPr>
+      <w:rPr>
+        <w:rFonts w:ascii="Symbol" w:hAnsi="Symbol" w:hint="default"/>
+      </w:rPr>
+    </w:lvl>
+    <w:lvl w:ilvl="1" w:tplc="04070003" w:tentative="1">
+      <w:start w:val="1"/>
+      <w:numFmt w:val="bullet"/>
+      <w:lvlText w:val="o"/>
+      <w:lvlJc w:val="left"/>
+      <w:pPr>
+        <w:ind w:left="1440" w:hanging="360"/>
+      </w:pPr>
+      <w:rPr>
+        <w:rFonts w:ascii="Courier New" w:hAnsi="Courier New" w:cs="Courier New" w:hint="default"/>
+      </w:rPr>
+    </w:lvl>
+    <w:lvl w:ilvl="2" w:tplc="04070005" w:tentative="1">
+      <w:start w:val="1"/>
+      <w:numFmt w:val="bullet"/>
+      <w:lvlText w:val=""/>
+      <w:lvlJc w:val="left"/>
+      <w:pPr>
+        <w:ind w:left="2160" w:hanging="360"/>
+      </w:pPr>
+      <w:rPr>
+        <w:rFonts w:ascii="Wingdings" w:hAnsi="Wingdings" w:hint="default"/>
+      </w:rPr>
+    </w:lvl>
+    <w:lvl w:ilvl="3" w:tplc="04070001" w:tentative="1">
+      <w:start w:val="1"/>
+      <w:numFmt w:val="bullet"/>
+      <w:lvlText w:val=""/>
+      <w:lvlJc w:val="left"/>
+      <w:pPr>
+        <w:ind w:left="2880" w:hanging="360"/>
+      </w:pPr>
+      <w:rPr>
+        <w:rFonts w:ascii="Symbol" w:hAnsi="Symbol" w:hint="default"/>
+      </w:rPr>
+    </w:lvl>
+    <w:lvl w:ilvl="4" w:tplc="04070003" w:tentative="1">
+      <w:start w:val="1"/>
+      <w:numFmt w:val="bullet"/>
+      <w:lvlText w:val="o"/>
+      <w:lvlJc w:val="left"/>
+      <w:pPr>
+        <w:ind w:left="3600" w:hanging="360"/>
+      </w:pPr>
+      <w:rPr>
+        <w:rFonts w:ascii="Courier New" w:hAnsi="Courier New" w:cs="Courier New" w:hint="default"/>
+      </w:rPr>
+    </w:lvl>
+    <w:lvl w:ilvl="5" w:tplc="04070005" w:tentative="1">
+      <w:start w:val="1"/>
+      <w:numFmt w:val="bullet"/>
+      <w:lvlText w:val=""/>
+      <w:lvlJc w:val="left"/>
+      <w:pPr>
+        <w:ind w:left="4320" w:hanging="360"/>
+      </w:pPr>
+      <w:rPr>
+        <w:rFonts w:ascii="Wingdings" w:hAnsi="Wingdings" w:hint="default"/>
+      </w:rPr>
+    </w:lvl>
+    <w:lvl w:ilvl="6" w:tplc="04070001" w:tentative="1">
+      <w:start w:val="1"/>
+      <w:numFmt w:val="bullet"/>
+      <w:lvlText w:val=""/>
+      <w:lvlJc w:val="left"/>
+      <w:pPr>
+        <w:ind w:left="5040" w:hanging="360"/>
+      </w:pPr>
+      <w:rPr>
+        <w:rFonts w:ascii="Symbol" w:hAnsi="Symbol" w:hint="default"/>
+      </w:rPr>
+    </w:lvl>
+    <w:lvl w:ilvl="7" w:tplc="04070003" w:tentative="1">
+      <w:start w:val="1"/>
+      <w:numFmt w:val="bullet"/>
+      <w:lvlText w:val="o"/>
+      <w:lvlJc w:val="left"/>
+      <w:pPr>
+        <w:ind w:left="5760" w:hanging="360"/>
+      </w:pPr>
+      <w:rPr>
+        <w:rFonts w:ascii="Courier New" w:hAnsi="Courier New" w:cs="Courier New" w:hint="default"/>
+      </w:rPr>
+    </w:lvl>
+    <w:lvl w:ilvl="8" w:tplc="04070005" w:tentative="1">
+      <w:start w:val="1"/>
+      <w:numFmt w:val="bullet"/>
+      <w:lvlText w:val=""/>
+      <w:lvlJc w:val="left"/>
+      <w:pPr>
+        <w:ind w:left="6480" w:hanging="360"/>
+      </w:pPr>
+      <w:rPr>
+        <w:rFonts w:ascii="Wingdings" w:hAnsi="Wingdings" w:hint="default"/>
+      </w:rPr>
+    </w:lvl>
+  </w:abstractNum>
+  <w:abstractNum w:abstractNumId="13" w15:restartNumberingAfterBreak="0">
     <w:nsid w:val="4BFB314E"/>
     <w:multiLevelType w:val="multilevel"/>
     <w:tmpl w:val="8620E33A"/>
@@ -4629,7 +2175,7 @@
       </w:rPr>
     </w:lvl>
   </w:abstractNum>
-  <w:abstractNum w:abstractNumId="12" w15:restartNumberingAfterBreak="0">
+  <w:abstractNum w:abstractNumId="14" w15:restartNumberingAfterBreak="0">
     <w:nsid w:val="4E067ED6"/>
     <w:multiLevelType w:val="multilevel"/>
     <w:tmpl w:val="4AE6D9DA"/>
@@ -4742,7 +2288,7 @@
       </w:pPr>
     </w:lvl>
   </w:abstractNum>
-  <w:abstractNum w:abstractNumId="13" w15:restartNumberingAfterBreak="0">
+  <w:abstractNum w:abstractNumId="15" w15:restartNumberingAfterBreak="0">
     <w:nsid w:val="4E9C0555"/>
     <w:multiLevelType w:val="multilevel"/>
     <w:tmpl w:val="6BECB9E6"/>
@@ -4855,7 +2401,7 @@
       </w:pPr>
     </w:lvl>
   </w:abstractNum>
-  <w:abstractNum w:abstractNumId="14" w15:restartNumberingAfterBreak="0">
+  <w:abstractNum w:abstractNumId="16" w15:restartNumberingAfterBreak="0">
     <w:nsid w:val="5242628E"/>
     <w:multiLevelType w:val="multilevel"/>
     <w:tmpl w:val="6CA80002"/>
@@ -5004,7 +2550,7 @@
       </w:rPr>
     </w:lvl>
   </w:abstractNum>
-  <w:abstractNum w:abstractNumId="15" w15:restartNumberingAfterBreak="0">
+  <w:abstractNum w:abstractNumId="17" w15:restartNumberingAfterBreak="0">
     <w:nsid w:val="5259653A"/>
     <w:multiLevelType w:val="multilevel"/>
     <w:tmpl w:val="3B9421FA"/>
@@ -5121,7 +2667,7 @@
       </w:pPr>
     </w:lvl>
   </w:abstractNum>
-  <w:abstractNum w:abstractNumId="16" w15:restartNumberingAfterBreak="0">
+  <w:abstractNum w:abstractNumId="18" w15:restartNumberingAfterBreak="0">
     <w:nsid w:val="5D8578EA"/>
     <w:multiLevelType w:val="multilevel"/>
     <w:tmpl w:val="D93C4F30"/>
@@ -5270,7 +2816,7 @@
       </w:rPr>
     </w:lvl>
   </w:abstractNum>
-  <w:abstractNum w:abstractNumId="17" w15:restartNumberingAfterBreak="0">
+  <w:abstractNum w:abstractNumId="19" w15:restartNumberingAfterBreak="0">
     <w:nsid w:val="600A3CAA"/>
     <w:multiLevelType w:val="multilevel"/>
     <w:tmpl w:val="0C825B4A"/>
@@ -5419,7 +2965,7 @@
       </w:rPr>
     </w:lvl>
   </w:abstractNum>
-  <w:abstractNum w:abstractNumId="18" w15:restartNumberingAfterBreak="0">
+  <w:abstractNum w:abstractNumId="20" w15:restartNumberingAfterBreak="0">
     <w:nsid w:val="6B991D6C"/>
     <w:multiLevelType w:val="multilevel"/>
     <w:tmpl w:val="FDD22C96"/>
@@ -5536,7 +3082,7 @@
       </w:pPr>
     </w:lvl>
   </w:abstractNum>
-  <w:abstractNum w:abstractNumId="19" w15:restartNumberingAfterBreak="0">
+  <w:abstractNum w:abstractNumId="21" w15:restartNumberingAfterBreak="0">
     <w:nsid w:val="6BD509A2"/>
     <w:multiLevelType w:val="multilevel"/>
     <w:tmpl w:val="5CE88CA6"/>
@@ -5685,7 +3231,7 @@
       </w:rPr>
     </w:lvl>
   </w:abstractNum>
-  <w:abstractNum w:abstractNumId="20" w15:restartNumberingAfterBreak="0">
+  <w:abstractNum w:abstractNumId="22" w15:restartNumberingAfterBreak="0">
     <w:nsid w:val="6D506EF9"/>
     <w:multiLevelType w:val="multilevel"/>
     <w:tmpl w:val="3732CD02"/>
@@ -5834,7 +3380,7 @@
       </w:rPr>
     </w:lvl>
   </w:abstractNum>
-  <w:abstractNum w:abstractNumId="21" w15:restartNumberingAfterBreak="0">
+  <w:abstractNum w:abstractNumId="23" w15:restartNumberingAfterBreak="0">
     <w:nsid w:val="73A012DD"/>
     <w:multiLevelType w:val="multilevel"/>
     <w:tmpl w:val="ADF04CEA"/>
@@ -5983,7 +3529,120 @@
       </w:rPr>
     </w:lvl>
   </w:abstractNum>
-  <w:abstractNum w:abstractNumId="22" w15:restartNumberingAfterBreak="0">
+  <w:abstractNum w:abstractNumId="24" w15:restartNumberingAfterBreak="0">
+    <w:nsid w:val="77C62C41"/>
+    <w:multiLevelType w:val="hybridMultilevel"/>
+    <w:tmpl w:val="D16C9E44"/>
+    <w:lvl w:ilvl="0" w:tplc="04070001">
+      <w:start w:val="1"/>
+      <w:numFmt w:val="bullet"/>
+      <w:lvlText w:val=""/>
+      <w:lvlJc w:val="left"/>
+      <w:pPr>
+        <w:ind w:left="720" w:hanging="360"/>
+      </w:pPr>
+      <w:rPr>
+        <w:rFonts w:ascii="Symbol" w:hAnsi="Symbol" w:hint="default"/>
+      </w:rPr>
+    </w:lvl>
+    <w:lvl w:ilvl="1" w:tplc="04070003" w:tentative="1">
+      <w:start w:val="1"/>
+      <w:numFmt w:val="bullet"/>
+      <w:lvlText w:val="o"/>
+      <w:lvlJc w:val="left"/>
+      <w:pPr>
+        <w:ind w:left="1440" w:hanging="360"/>
+      </w:pPr>
+      <w:rPr>
+        <w:rFonts w:ascii="Courier New" w:hAnsi="Courier New" w:cs="Courier New" w:hint="default"/>
+      </w:rPr>
+    </w:lvl>
+    <w:lvl w:ilvl="2" w:tplc="04070005" w:tentative="1">
+      <w:start w:val="1"/>
+      <w:numFmt w:val="bullet"/>
+      <w:lvlText w:val=""/>
+      <w:lvlJc w:val="left"/>
+      <w:pPr>
+        <w:ind w:left="2160" w:hanging="360"/>
+      </w:pPr>
+      <w:rPr>
+        <w:rFonts w:ascii="Wingdings" w:hAnsi="Wingdings" w:hint="default"/>
+      </w:rPr>
+    </w:lvl>
+    <w:lvl w:ilvl="3" w:tplc="04070001" w:tentative="1">
+      <w:start w:val="1"/>
+      <w:numFmt w:val="bullet"/>
+      <w:lvlText w:val=""/>
+      <w:lvlJc w:val="left"/>
+      <w:pPr>
+        <w:ind w:left="2880" w:hanging="360"/>
+      </w:pPr>
+      <w:rPr>
+        <w:rFonts w:ascii="Symbol" w:hAnsi="Symbol" w:hint="default"/>
+      </w:rPr>
+    </w:lvl>
+    <w:lvl w:ilvl="4" w:tplc="04070003" w:tentative="1">
+      <w:start w:val="1"/>
+      <w:numFmt w:val="bullet"/>
+      <w:lvlText w:val="o"/>
+      <w:lvlJc w:val="left"/>
+      <w:pPr>
+        <w:ind w:left="3600" w:hanging="360"/>
+      </w:pPr>
+      <w:rPr>
+        <w:rFonts w:ascii="Courier New" w:hAnsi="Courier New" w:cs="Courier New" w:hint="default"/>
+      </w:rPr>
+    </w:lvl>
+    <w:lvl w:ilvl="5" w:tplc="04070005" w:tentative="1">
+      <w:start w:val="1"/>
+      <w:numFmt w:val="bullet"/>
+      <w:lvlText w:val=""/>
+      <w:lvlJc w:val="left"/>
+      <w:pPr>
+        <w:ind w:left="4320" w:hanging="360"/>
+      </w:pPr>
+      <w:rPr>
+        <w:rFonts w:ascii="Wingdings" w:hAnsi="Wingdings" w:hint="default"/>
+      </w:rPr>
+    </w:lvl>
+    <w:lvl w:ilvl="6" w:tplc="04070001" w:tentative="1">
+      <w:start w:val="1"/>
+      <w:numFmt w:val="bullet"/>
+      <w:lvlText w:val=""/>
+      <w:lvlJc w:val="left"/>
+      <w:pPr>
+        <w:ind w:left="5040" w:hanging="360"/>
+      </w:pPr>
+      <w:rPr>
+        <w:rFonts w:ascii="Symbol" w:hAnsi="Symbol" w:hint="default"/>
+      </w:rPr>
+    </w:lvl>
+    <w:lvl w:ilvl="7" w:tplc="04070003" w:tentative="1">
+      <w:start w:val="1"/>
+      <w:numFmt w:val="bullet"/>
+      <w:lvlText w:val="o"/>
+      <w:lvlJc w:val="left"/>
+      <w:pPr>
+        <w:ind w:left="5760" w:hanging="360"/>
+      </w:pPr>
+      <w:rPr>
+        <w:rFonts w:ascii="Courier New" w:hAnsi="Courier New" w:cs="Courier New" w:hint="default"/>
+      </w:rPr>
+    </w:lvl>
+    <w:lvl w:ilvl="8" w:tplc="04070005" w:tentative="1">
+      <w:start w:val="1"/>
+      <w:numFmt w:val="bullet"/>
+      <w:lvlText w:val=""/>
+      <w:lvlJc w:val="left"/>
+      <w:pPr>
+        <w:ind w:left="6480" w:hanging="360"/>
+      </w:pPr>
+      <w:rPr>
+        <w:rFonts w:ascii="Wingdings" w:hAnsi="Wingdings" w:hint="default"/>
+      </w:rPr>
+    </w:lvl>
+  </w:abstractNum>
+  <w:abstractNum w:abstractNumId="25" w15:restartNumberingAfterBreak="0">
     <w:nsid w:val="7DFA42DF"/>
     <w:multiLevelType w:val="hybridMultilevel"/>
     <w:tmpl w:val="2A6E2CEA"/>
@@ -6069,7 +3728,7 @@
       </w:pPr>
     </w:lvl>
   </w:abstractNum>
-  <w:abstractNum w:abstractNumId="23" w15:restartNumberingAfterBreak="0">
+  <w:abstractNum w:abstractNumId="26" w15:restartNumberingAfterBreak="0">
     <w:nsid w:val="7F2179AF"/>
     <w:multiLevelType w:val="hybridMultilevel"/>
     <w:tmpl w:val="F29A82F0"/>
@@ -6183,7 +3842,7 @@
     </w:lvl>
   </w:abstractNum>
   <w:num w:numId="1" w16cid:durableId="1714421892">
-    <w:abstractNumId w:val="14"/>
+    <w:abstractNumId w:val="16"/>
   </w:num>
   <w:num w:numId="2" w16cid:durableId="1743790832">
     <w:abstractNumId w:val="0"/>
@@ -6192,13 +3851,13 @@
     <w:abstractNumId w:val="1"/>
   </w:num>
   <w:num w:numId="4" w16cid:durableId="297730711">
-    <w:abstractNumId w:val="8"/>
+    <w:abstractNumId w:val="9"/>
   </w:num>
   <w:num w:numId="5" w16cid:durableId="1686857546">
     <w:abstractNumId w:val="4"/>
   </w:num>
   <w:num w:numId="6" w16cid:durableId="1887447754">
-    <w:abstractNumId w:val="11"/>
+    <w:abstractNumId w:val="13"/>
   </w:num>
   <w:num w:numId="7" w16cid:durableId="2075616766">
     <w:abstractNumId w:val="7"/>
@@ -6210,22 +3869,22 @@
     <w:abstractNumId w:val="5"/>
   </w:num>
   <w:num w:numId="10" w16cid:durableId="1769690678">
-    <w:abstractNumId w:val="10"/>
+    <w:abstractNumId w:val="11"/>
   </w:num>
   <w:num w:numId="11" w16cid:durableId="306279264">
-    <w:abstractNumId w:val="19"/>
+    <w:abstractNumId w:val="21"/>
   </w:num>
   <w:num w:numId="12" w16cid:durableId="877351289">
-    <w:abstractNumId w:val="20"/>
+    <w:abstractNumId w:val="22"/>
   </w:num>
   <w:num w:numId="13" w16cid:durableId="699089827">
-    <w:abstractNumId w:val="13"/>
+    <w:abstractNumId w:val="15"/>
   </w:num>
   <w:num w:numId="14" w16cid:durableId="1881896109">
-    <w:abstractNumId w:val="15"/>
+    <w:abstractNumId w:val="17"/>
   </w:num>
   <w:num w:numId="15" w16cid:durableId="2366916">
-    <w:abstractNumId w:val="18"/>
+    <w:abstractNumId w:val="20"/>
   </w:num>
   <w:num w:numId="16" w16cid:durableId="127748588">
     <w:abstractNumId w:val="6"/>
@@ -6234,25 +3893,34 @@
     <w:abstractNumId w:val="3"/>
   </w:num>
   <w:num w:numId="18" w16cid:durableId="1072772949">
-    <w:abstractNumId w:val="17"/>
+    <w:abstractNumId w:val="19"/>
   </w:num>
   <w:num w:numId="19" w16cid:durableId="797072383">
+    <w:abstractNumId w:val="26"/>
+  </w:num>
+  <w:num w:numId="20" w16cid:durableId="1606188808">
+    <w:abstractNumId w:val="10"/>
+  </w:num>
+  <w:num w:numId="21" w16cid:durableId="884760495">
+    <w:abstractNumId w:val="25"/>
+  </w:num>
+  <w:num w:numId="22" w16cid:durableId="511578511">
     <w:abstractNumId w:val="23"/>
   </w:num>
-  <w:num w:numId="20" w16cid:durableId="1606188808">
-    <w:abstractNumId w:val="9"/>
-  </w:num>
-  <w:num w:numId="21" w16cid:durableId="884760495">
-    <w:abstractNumId w:val="22"/>
-  </w:num>
-  <w:num w:numId="22" w16cid:durableId="511578511">
-    <w:abstractNumId w:val="21"/>
-  </w:num>
   <w:num w:numId="23" w16cid:durableId="258294613">
-    <w:abstractNumId w:val="12"/>
+    <w:abstractNumId w:val="14"/>
   </w:num>
   <w:num w:numId="24" w16cid:durableId="800004329">
-    <w:abstractNumId w:val="16"/>
+    <w:abstractNumId w:val="18"/>
+  </w:num>
+  <w:num w:numId="25" w16cid:durableId="1871019940">
+    <w:abstractNumId w:val="8"/>
+  </w:num>
+  <w:num w:numId="26" w16cid:durableId="1319576901">
+    <w:abstractNumId w:val="24"/>
+  </w:num>
+  <w:num w:numId="27" w16cid:durableId="197667544">
+    <w:abstractNumId w:val="12"/>
   </w:num>
 </w:numbering>
 </file>
@@ -6860,7 +4528,6 @@
   <w:style w:type="character" w:default="1" w:styleId="Absatz-Standardschriftart">
     <w:name w:val="Default Paragraph Font"/>
     <w:uiPriority w:val="1"/>
-    <w:semiHidden/>
     <w:unhideWhenUsed/>
   </w:style>
   <w:style w:type="table" w:default="1" w:styleId="NormaleTabelle">

</xml_diff>